<commit_message>
Separate buyer, user and behaviour actor; add revenue model
Step 1 now asks apart who buys, who uses the product day to day, and whose
behaviour must change for the environmental benefit to happen, and asks for
the revenue model separately from the customer segment.

Next steps use the new answers: a missing behaviour actor for enabling
startups becomes an action; a buyer who differs from the user or the
behaviour actor triggers a prompt about evidence of use; subscription,
one-off sale, licensing and pay-per-use each get a prompt about how usage
data can be obtained. FieldSense sample and its report updated.

Co-Authored-By: Claude Opus 5.5 <noreply@anthropic.com>
Claude-Session: https://claude.ai/code/session_01NsReyfcWBUffzS8XqtSvgs
</commit_message>
<xml_diff>
--- a/sample_reports/FieldSense_impact_report.docx
+++ b/sample_reports/FieldSense_impact_report.docx
@@ -262,7 +262,7 @@
           <w:b/>
           <w:bCs/>
         </w:rPr>
-        <w:t xml:space="preserve">Customer type: </w:t>
+        <w:t xml:space="preserve">Customer segment: </w:t>
       </w:r>
       <w:r>
         <w:t xml:space="preserve">B2B</w:t>
@@ -281,10 +281,67 @@
           <w:b/>
           <w:bCs/>
         </w:rPr>
-        <w:t xml:space="preserve">Ideal customer profile: </w:t>
-      </w:r>
-      <w:r>
-        <w:t xml:space="preserve">Small and mid-size vegetable and orchard farms (20–500 ha) in dry regions that irrigate from metered wells or paid water sources. The farmer or farm manager decides on irrigation and pays for the subscription.</w:t>
+        <w:t xml:space="preserve">Revenue model: </w:t>
+      </w:r>
+      <w:r>
+        <w:t xml:space="preserve">Device or equipment plus a subscription</w:t>
+      </w:r>
+    </w:p>
+    <w:p>
+      <w:pPr>
+        <w:pStyle w:val="ListParagraph"/>
+        <w:numPr>
+          <w:ilvl w:val="0"/>
+          <w:numId w:val="1"/>
+        </w:numPr>
+      </w:pPr>
+      <w:r>
+        <w:rPr>
+          <w:b/>
+          <w:bCs/>
+        </w:rPr>
+        <w:t xml:space="preserve">Buyer (decides and pays): </w:t>
+      </w:r>
+      <w:r>
+        <w:t xml:space="preserve">Owners of small and mid-size vegetable and orchard farms (20–500 ha) in dry regions that irrigate from metered wells or paid water sources.</w:t>
+      </w:r>
+    </w:p>
+    <w:p>
+      <w:pPr>
+        <w:pStyle w:val="ListParagraph"/>
+        <w:numPr>
+          <w:ilvl w:val="0"/>
+          <w:numId w:val="1"/>
+        </w:numPr>
+      </w:pPr>
+      <w:r>
+        <w:rPr>
+          <w:b/>
+          <w:bCs/>
+        </w:rPr>
+        <w:t xml:space="preserve">User (day to day): </w:t>
+      </w:r>
+      <w:r>
+        <w:t xml:space="preserve">Farm managers and irrigation staff who check the app and run the irrigation system.</w:t>
+      </w:r>
+    </w:p>
+    <w:p>
+      <w:pPr>
+        <w:pStyle w:val="ListParagraph"/>
+        <w:numPr>
+          <w:ilvl w:val="0"/>
+          <w:numId w:val="1"/>
+        </w:numPr>
+      </w:pPr>
+      <w:r>
+        <w:rPr>
+          <w:b/>
+          <w:bCs/>
+        </w:rPr>
+        <w:t xml:space="preserve">Whose behaviour must change: </w:t>
+      </w:r>
+      <w:r>
+        <w:t xml:space="preserve">Whoever decides when and how much to irrigate on the farm (usually the farm manager, not the owner).</w:t>
       </w:r>
     </w:p>
     <w:p>
@@ -1687,10 +1744,29 @@
           <w:b/>
           <w:bCs/>
         </w:rPr>
-        <w:t xml:space="preserve">Is the user the same person as the payer?  </w:t>
-      </w:r>
-      <w:r>
-        <w:t xml:space="preserve">Have you considered who actually has to change their behaviour: the person who buys the product, or someone else (an employee, a tenant, an end user)? If they differ, your adoption evidence has to come from the user, not from the sale.</w:t>
+        <w:t xml:space="preserve">Is your evidence about the right people?  </w:t>
+      </w:r>
+      <w:r>
+        <w:t xml:space="preserve">The buyer (Owners of small and mid-size vegetable and orchard farms…) is not the one whose behaviour must change (Whoever decides when and how much to irrigate on the…). Have you considered how you will show that those people actually change what they do? A signed contract or a sold licence is evidence of purchase, not of behaviour change.</w:t>
+      </w:r>
+    </w:p>
+    <w:p>
+      <w:pPr>
+        <w:pStyle w:val="ListParagraph"/>
+        <w:numPr>
+          <w:ilvl w:val="0"/>
+          <w:numId w:val="1"/>
+        </w:numPr>
+      </w:pPr>
+      <w:r>
+        <w:rPr>
+          <w:b/>
+          <w:bCs/>
+        </w:rPr>
+        <w:t xml:space="preserve">Does churn also cut your impact?  </w:t>
+      </w:r>
+      <w:r>
+        <w:t xml:space="preserve">With a subscription, a customer who cancels stops producing impact. Have you considered reporting active, retained customers rather than total sign-ups? Your retention figure then doubles as adoption evidence.</w:t>
       </w:r>
     </w:p>
     <w:p>

</xml_diff>

<commit_message>
Add cause-and-effect pathway diagram with customer-dependent steps
Step 2 now shows the impact pathway as a three-lane diagram (your startup /
customers & users / environment). Each stage gets a "Does this step depend
on customers?" field (none / adoption / behaviour change), pre-filled from
the pathway template. Customer steps are badged in orange and the handover
from technology to customers is highlighted. Step 2 warns when no customer
step has at least moderate evidence, and the next steps add "Prove the
customer side, not only the technology".

The diagram is included in the HTML/PDF report and, as an image, in the
Word report. Markdown lists the customer-dependent steps.

Co-Authored-By: Claude Opus 5.5 <noreply@anthropic.com>
Claude-Session: https://claude.ai/code/session_01NsReyfcWBUffzS8XqtSvgs
</commit_message>
<xml_diff>
--- a/sample_reports/FieldSense_impact_report.docx
+++ b/sample_reports/FieldSense_impact_report.docx
@@ -411,6 +411,48 @@
       </w:r>
     </w:p>
     <w:p>
+      <w:r>
+        <w:drawing>
+          <wp:inline distT="0" distB="0" distL="0" distR="0">
+            <wp:extent cx="5905500" cy="2781300"/>
+            <wp:effectExtent t="0" r="0" b="0" l="0"/>
+            <wp:docPr id="1" name="" descr="" title=""/>
+            <wp:cNvGraphicFramePr>
+              <a:graphicFrameLocks xmlns:a="http://schemas.openxmlformats.org/drawingml/2006/main" noChangeAspect="1"/>
+            </wp:cNvGraphicFramePr>
+            <a:graphic xmlns:a="http://schemas.openxmlformats.org/drawingml/2006/main">
+              <a:graphicData uri="http://schemas.openxmlformats.org/drawingml/2006/picture">
+                <pic:pic xmlns:pic="http://schemas.openxmlformats.org/drawingml/2006/picture">
+                  <pic:nvPicPr>
+                    <pic:cNvPr id="0" name="" descr=""/>
+                    <pic:cNvPicPr>
+                      <a:picLocks noChangeAspect="1" noChangeArrowheads="1"/>
+                    </pic:cNvPicPr>
+                  </pic:nvPicPr>
+                  <pic:blipFill>
+                    <a:blip r:embed="rId8" cstate="none"/>
+                    <a:srcRect/>
+                    <a:stretch>
+                      <a:fillRect/>
+                    </a:stretch>
+                  </pic:blipFill>
+                  <pic:spPr bwMode="auto">
+                    <a:xfrm>
+                      <a:off x="0" y="0"/>
+                      <a:ext cx="5905500" cy="2781300"/>
+                    </a:xfrm>
+                    <a:prstGeom prst="rect">
+                      <a:avLst/>
+                    </a:prstGeom>
+                  </pic:spPr>
+                </pic:pic>
+              </a:graphicData>
+            </a:graphic>
+          </wp:inline>
+        </w:drawing>
+      </w:r>
+    </w:p>
+    <w:p>
       <w:pPr>
         <w:pStyle w:val="Heading3"/>
       </w:pPr>
@@ -461,6 +503,14 @@
       <w:r>
         <w:t xml:space="preserve">Outputs: customer adoption</w:t>
       </w:r>
+      <w:r>
+        <w:rPr>
+          <w:b/>
+          <w:bCs/>
+          <w:color w:val="D9661F"/>
+        </w:rPr>
+        <w:t xml:space="preserve">  [ADOPTION NEEDED]</w:t>
+      </w:r>
     </w:p>
     <w:p>
       <w:pPr>
@@ -504,6 +554,14 @@
       </w:pPr>
       <w:r>
         <w:t xml:space="preserve">Outcomes: customer behavior change</w:t>
+      </w:r>
+      <w:r>
+        <w:rPr>
+          <w:b/>
+          <w:bCs/>
+          <w:color w:val="D9661F"/>
+        </w:rPr>
+        <w:t xml:space="preserve">  [BEHAVIOUR CHANGE NEEDED]</w:t>
       </w:r>
     </w:p>
     <w:p>

</xml_diff>

<commit_message>
Highlight indicators of adoption and real-world outcomes
Every indicator is tagged by what it measures (real-world outcome,
adoption & use, technology only, own operations, governance); outcome and
adoption indicators are highlighted in step 3. Adds bank indicators for
outcome per participating customer, active use, retention, actual
end-of-life recovery, and units produced as a technology-only contrast
(no thesis citation). Custom indicators require a kind.

New integrity check and next step when the core set measures only the
technology or the company. The Word report adds a "Measures" column.

Co-Authored-By: Claude Opus 5.5 <noreply@anthropic.com>
Claude-Session: https://claude.ai/code/session_01NsReyfcWBUffzS8XqtSvgs
</commit_message>
<xml_diff>
--- a/sample_reports/FieldSense_impact_report.docx
+++ b/sample_reports/FieldSense_impact_report.docx
@@ -688,6 +688,7 @@
         <w:gridCol w:w="100"/>
         <w:gridCol w:w="100"/>
         <w:gridCol w:w="100"/>
+        <w:gridCol w:w="100"/>
       </w:tblGrid>
       <w:tr>
         <w:trPr>
@@ -695,7 +696,7 @@
         </w:trPr>
         <w:tc>
           <w:tcPr>
-            <w:tcW w:type="pct" w:w="30%"/>
+            <w:tcW w:type="pct" w:w="27%"/>
             <w:tcBorders>
               <w:top w:val="single" w:color="C9D8CE" w:sz="4"/>
               <w:left w:val="single" w:color="C9D8CE" w:sz="4"/>
@@ -725,7 +726,7 @@
         </w:tc>
         <w:tc>
           <w:tcPr>
-            <w:tcW w:type="pct" w:w="18%"/>
+            <w:tcW w:type="pct" w:w="15%"/>
             <w:tcBorders>
               <w:top w:val="single" w:color="C9D8CE" w:sz="4"/>
               <w:left w:val="single" w:color="C9D8CE" w:sz="4"/>
@@ -755,7 +756,7 @@
         </w:tc>
         <w:tc>
           <w:tcPr>
-            <w:tcW w:type="pct" w:w="8%"/>
+            <w:tcW w:type="pct" w:w="14%"/>
             <w:tcBorders>
               <w:top w:val="single" w:color="C9D8CE" w:sz="4"/>
               <w:left w:val="single" w:color="C9D8CE" w:sz="4"/>
@@ -779,13 +780,13 @@
                 <w:sz w:val="19"/>
                 <w:szCs w:val="19"/>
               </w:rPr>
-              <w:t xml:space="preserve">Feas.</w:t>
-            </w:r>
-          </w:p>
-        </w:tc>
-        <w:tc>
-          <w:tcPr>
-            <w:tcW w:type="pct" w:w="8%"/>
+              <w:t xml:space="preserve">Measures</w:t>
+            </w:r>
+          </w:p>
+        </w:tc>
+        <w:tc>
+          <w:tcPr>
+            <w:tcW w:type="pct" w:w="7%"/>
             <w:tcBorders>
               <w:top w:val="single" w:color="C9D8CE" w:sz="4"/>
               <w:left w:val="single" w:color="C9D8CE" w:sz="4"/>
@@ -809,13 +810,13 @@
                 <w:sz w:val="19"/>
                 <w:szCs w:val="19"/>
               </w:rPr>
-              <w:t xml:space="preserve">Rel.</w:t>
-            </w:r>
-          </w:p>
-        </w:tc>
-        <w:tc>
-          <w:tcPr>
-            <w:tcW w:type="pct" w:w="36%"/>
+              <w:t xml:space="preserve">Feas.</w:t>
+            </w:r>
+          </w:p>
+        </w:tc>
+        <w:tc>
+          <w:tcPr>
+            <w:tcW w:type="pct" w:w="7%"/>
             <w:tcBorders>
               <w:top w:val="single" w:color="C9D8CE" w:sz="4"/>
               <w:left w:val="single" w:color="C9D8CE" w:sz="4"/>
@@ -839,6 +840,36 @@
                 <w:sz w:val="19"/>
                 <w:szCs w:val="19"/>
               </w:rPr>
+              <w:t xml:space="preserve">Rel.</w:t>
+            </w:r>
+          </w:p>
+        </w:tc>
+        <w:tc>
+          <w:tcPr>
+            <w:tcW w:type="pct" w:w="30%"/>
+            <w:tcBorders>
+              <w:top w:val="single" w:color="C9D8CE" w:sz="4"/>
+              <w:left w:val="single" w:color="C9D8CE" w:sz="4"/>
+              <w:bottom w:val="single" w:color="C9D8CE" w:sz="4"/>
+              <w:right w:val="single" w:color="C9D8CE" w:sz="4"/>
+            </w:tcBorders>
+            <w:shd w:fill="2E6B4F" w:color="auto" w:val="clear"/>
+            <w:tcMar>
+              <w:top w:type="dxa" w:w="60"/>
+              <w:left w:type="dxa" w:w="90"/>
+              <w:bottom w:type="dxa" w:w="60"/>
+              <w:right w:type="dxa" w:w="90"/>
+            </w:tcMar>
+          </w:tcPr>
+          <w:p>
+            <w:r>
+              <w:rPr>
+                <w:b/>
+                <w:bCs/>
+                <w:color w:val="FFFFFF"/>
+                <w:sz w:val="19"/>
+                <w:szCs w:val="19"/>
+              </w:rPr>
               <w:t xml:space="preserve">Details</w:t>
             </w:r>
           </w:p>
@@ -847,7 +878,7 @@
       <w:tr>
         <w:tc>
           <w:tcPr>
-            <w:tcW w:type="pct" w:w="30%"/>
+            <w:tcW w:type="pct" w:w="27%"/>
             <w:tcBorders>
               <w:top w:val="single" w:color="C9D8CE" w:sz="4"/>
               <w:left w:val="single" w:color="C9D8CE" w:sz="4"/>
@@ -875,7 +906,7 @@
         </w:tc>
         <w:tc>
           <w:tcPr>
-            <w:tcW w:type="pct" w:w="18%"/>
+            <w:tcW w:type="pct" w:w="15%"/>
             <w:tcBorders>
               <w:top w:val="single" w:color="C9D8CE" w:sz="4"/>
               <w:left w:val="single" w:color="C9D8CE" w:sz="4"/>
@@ -903,7 +934,36 @@
         </w:tc>
         <w:tc>
           <w:tcPr>
-            <w:tcW w:type="pct" w:w="8%"/>
+            <w:tcW w:type="pct" w:w="14%"/>
+            <w:tcBorders>
+              <w:top w:val="single" w:color="C9D8CE" w:sz="4"/>
+              <w:left w:val="single" w:color="C9D8CE" w:sz="4"/>
+              <w:bottom w:val="single" w:color="C9D8CE" w:sz="4"/>
+              <w:right w:val="single" w:color="C9D8CE" w:sz="4"/>
+            </w:tcBorders>
+            <w:tcMar>
+              <w:top w:type="dxa" w:w="60"/>
+              <w:left w:type="dxa" w:w="90"/>
+              <w:bottom w:type="dxa" w:w="60"/>
+              <w:right w:type="dxa" w:w="90"/>
+            </w:tcMar>
+          </w:tcPr>
+          <w:p>
+            <w:r>
+              <w:rPr>
+                <w:b/>
+                <w:bCs/>
+                <w:color w:val="2E6B4F"/>
+                <w:sz w:val="19"/>
+                <w:szCs w:val="19"/>
+              </w:rPr>
+              <w:t xml:space="preserve">Adoption &amp; use</w:t>
+            </w:r>
+          </w:p>
+        </w:tc>
+        <w:tc>
+          <w:tcPr>
+            <w:tcW w:type="pct" w:w="7%"/>
             <w:tcBorders>
               <w:top w:val="single" w:color="C9D8CE" w:sz="4"/>
               <w:left w:val="single" w:color="C9D8CE" w:sz="4"/>
@@ -931,7 +991,7 @@
         </w:tc>
         <w:tc>
           <w:tcPr>
-            <w:tcW w:type="pct" w:w="8%"/>
+            <w:tcW w:type="pct" w:w="7%"/>
             <w:tcBorders>
               <w:top w:val="single" w:color="C9D8CE" w:sz="4"/>
               <w:left w:val="single" w:color="C9D8CE" w:sz="4"/>
@@ -959,7 +1019,7 @@
         </w:tc>
         <w:tc>
           <w:tcPr>
-            <w:tcW w:type="pct" w:w="36%"/>
+            <w:tcW w:type="pct" w:w="30%"/>
             <w:tcBorders>
               <w:top w:val="single" w:color="C9D8CE" w:sz="4"/>
               <w:left w:val="single" w:color="C9D8CE" w:sz="4"/>
@@ -989,7 +1049,7 @@
       <w:tr>
         <w:tc>
           <w:tcPr>
-            <w:tcW w:type="pct" w:w="30%"/>
+            <w:tcW w:type="pct" w:w="27%"/>
             <w:tcBorders>
               <w:top w:val="single" w:color="C9D8CE" w:sz="4"/>
               <w:left w:val="single" w:color="C9D8CE" w:sz="4"/>
@@ -1018,7 +1078,7 @@
         </w:tc>
         <w:tc>
           <w:tcPr>
-            <w:tcW w:type="pct" w:w="18%"/>
+            <w:tcW w:type="pct" w:w="15%"/>
             <w:tcBorders>
               <w:top w:val="single" w:color="C9D8CE" w:sz="4"/>
               <w:left w:val="single" w:color="C9D8CE" w:sz="4"/>
@@ -1047,7 +1107,37 @@
         </w:tc>
         <w:tc>
           <w:tcPr>
-            <w:tcW w:type="pct" w:w="8%"/>
+            <w:tcW w:type="pct" w:w="14%"/>
+            <w:tcBorders>
+              <w:top w:val="single" w:color="C9D8CE" w:sz="4"/>
+              <w:left w:val="single" w:color="C9D8CE" w:sz="4"/>
+              <w:bottom w:val="single" w:color="C9D8CE" w:sz="4"/>
+              <w:right w:val="single" w:color="C9D8CE" w:sz="4"/>
+            </w:tcBorders>
+            <w:shd w:fill="EAF2ED" w:color="auto" w:val="clear"/>
+            <w:tcMar>
+              <w:top w:type="dxa" w:w="60"/>
+              <w:left w:type="dxa" w:w="90"/>
+              <w:bottom w:type="dxa" w:w="60"/>
+              <w:right w:type="dxa" w:w="90"/>
+            </w:tcMar>
+          </w:tcPr>
+          <w:p>
+            <w:r>
+              <w:rPr>
+                <w:b/>
+                <w:bCs/>
+                <w:color w:val="2E6B4F"/>
+                <w:sz w:val="19"/>
+                <w:szCs w:val="19"/>
+              </w:rPr>
+              <w:t xml:space="preserve">Adoption &amp; use</w:t>
+            </w:r>
+          </w:p>
+        </w:tc>
+        <w:tc>
+          <w:tcPr>
+            <w:tcW w:type="pct" w:w="7%"/>
             <w:tcBorders>
               <w:top w:val="single" w:color="C9D8CE" w:sz="4"/>
               <w:left w:val="single" w:color="C9D8CE" w:sz="4"/>
@@ -1076,7 +1166,7 @@
         </w:tc>
         <w:tc>
           <w:tcPr>
-            <w:tcW w:type="pct" w:w="8%"/>
+            <w:tcW w:type="pct" w:w="7%"/>
             <w:tcBorders>
               <w:top w:val="single" w:color="C9D8CE" w:sz="4"/>
               <w:left w:val="single" w:color="C9D8CE" w:sz="4"/>
@@ -1105,7 +1195,7 @@
         </w:tc>
         <w:tc>
           <w:tcPr>
-            <w:tcW w:type="pct" w:w="36%"/>
+            <w:tcW w:type="pct" w:w="30%"/>
             <w:tcBorders>
               <w:top w:val="single" w:color="C9D8CE" w:sz="4"/>
               <w:left w:val="single" w:color="C9D8CE" w:sz="4"/>
@@ -1165,6 +1255,7 @@
         <w:gridCol w:w="100"/>
         <w:gridCol w:w="100"/>
         <w:gridCol w:w="100"/>
+        <w:gridCol w:w="100"/>
       </w:tblGrid>
       <w:tr>
         <w:trPr>
@@ -1172,7 +1263,7 @@
         </w:trPr>
         <w:tc>
           <w:tcPr>
-            <w:tcW w:type="pct" w:w="30%"/>
+            <w:tcW w:type="pct" w:w="27%"/>
             <w:tcBorders>
               <w:top w:val="single" w:color="C9D8CE" w:sz="4"/>
               <w:left w:val="single" w:color="C9D8CE" w:sz="4"/>
@@ -1202,7 +1293,7 @@
         </w:tc>
         <w:tc>
           <w:tcPr>
-            <w:tcW w:type="pct" w:w="18%"/>
+            <w:tcW w:type="pct" w:w="15%"/>
             <w:tcBorders>
               <w:top w:val="single" w:color="C9D8CE" w:sz="4"/>
               <w:left w:val="single" w:color="C9D8CE" w:sz="4"/>
@@ -1232,7 +1323,7 @@
         </w:tc>
         <w:tc>
           <w:tcPr>
-            <w:tcW w:type="pct" w:w="8%"/>
+            <w:tcW w:type="pct" w:w="14%"/>
             <w:tcBorders>
               <w:top w:val="single" w:color="C9D8CE" w:sz="4"/>
               <w:left w:val="single" w:color="C9D8CE" w:sz="4"/>
@@ -1256,13 +1347,13 @@
                 <w:sz w:val="19"/>
                 <w:szCs w:val="19"/>
               </w:rPr>
-              <w:t xml:space="preserve">Feas.</w:t>
-            </w:r>
-          </w:p>
-        </w:tc>
-        <w:tc>
-          <w:tcPr>
-            <w:tcW w:type="pct" w:w="8%"/>
+              <w:t xml:space="preserve">Measures</w:t>
+            </w:r>
+          </w:p>
+        </w:tc>
+        <w:tc>
+          <w:tcPr>
+            <w:tcW w:type="pct" w:w="7%"/>
             <w:tcBorders>
               <w:top w:val="single" w:color="C9D8CE" w:sz="4"/>
               <w:left w:val="single" w:color="C9D8CE" w:sz="4"/>
@@ -1286,13 +1377,13 @@
                 <w:sz w:val="19"/>
                 <w:szCs w:val="19"/>
               </w:rPr>
-              <w:t xml:space="preserve">Rel.</w:t>
-            </w:r>
-          </w:p>
-        </w:tc>
-        <w:tc>
-          <w:tcPr>
-            <w:tcW w:type="pct" w:w="36%"/>
+              <w:t xml:space="preserve">Feas.</w:t>
+            </w:r>
+          </w:p>
+        </w:tc>
+        <w:tc>
+          <w:tcPr>
+            <w:tcW w:type="pct" w:w="7%"/>
             <w:tcBorders>
               <w:top w:val="single" w:color="C9D8CE" w:sz="4"/>
               <w:left w:val="single" w:color="C9D8CE" w:sz="4"/>
@@ -1316,6 +1407,36 @@
                 <w:sz w:val="19"/>
                 <w:szCs w:val="19"/>
               </w:rPr>
+              <w:t xml:space="preserve">Rel.</w:t>
+            </w:r>
+          </w:p>
+        </w:tc>
+        <w:tc>
+          <w:tcPr>
+            <w:tcW w:type="pct" w:w="30%"/>
+            <w:tcBorders>
+              <w:top w:val="single" w:color="C9D8CE" w:sz="4"/>
+              <w:left w:val="single" w:color="C9D8CE" w:sz="4"/>
+              <w:bottom w:val="single" w:color="C9D8CE" w:sz="4"/>
+              <w:right w:val="single" w:color="C9D8CE" w:sz="4"/>
+            </w:tcBorders>
+            <w:shd w:fill="2E6B4F" w:color="auto" w:val="clear"/>
+            <w:tcMar>
+              <w:top w:type="dxa" w:w="60"/>
+              <w:left w:type="dxa" w:w="90"/>
+              <w:bottom w:type="dxa" w:w="60"/>
+              <w:right w:type="dxa" w:w="90"/>
+            </w:tcMar>
+          </w:tcPr>
+          <w:p>
+            <w:r>
+              <w:rPr>
+                <w:b/>
+                <w:bCs/>
+                <w:color w:val="FFFFFF"/>
+                <w:sz w:val="19"/>
+                <w:szCs w:val="19"/>
+              </w:rPr>
               <w:t xml:space="preserve">Details</w:t>
             </w:r>
           </w:p>
@@ -1324,7 +1445,7 @@
       <w:tr>
         <w:tc>
           <w:tcPr>
-            <w:tcW w:type="pct" w:w="30%"/>
+            <w:tcW w:type="pct" w:w="27%"/>
             <w:tcBorders>
               <w:top w:val="single" w:color="C9D8CE" w:sz="4"/>
               <w:left w:val="single" w:color="C9D8CE" w:sz="4"/>
@@ -1352,7 +1473,7 @@
         </w:tc>
         <w:tc>
           <w:tcPr>
-            <w:tcW w:type="pct" w:w="18%"/>
+            <w:tcW w:type="pct" w:w="15%"/>
             <w:tcBorders>
               <w:top w:val="single" w:color="C9D8CE" w:sz="4"/>
               <w:left w:val="single" w:color="C9D8CE" w:sz="4"/>
@@ -1380,7 +1501,36 @@
         </w:tc>
         <w:tc>
           <w:tcPr>
-            <w:tcW w:type="pct" w:w="8%"/>
+            <w:tcW w:type="pct" w:w="14%"/>
+            <w:tcBorders>
+              <w:top w:val="single" w:color="C9D8CE" w:sz="4"/>
+              <w:left w:val="single" w:color="C9D8CE" w:sz="4"/>
+              <w:bottom w:val="single" w:color="C9D8CE" w:sz="4"/>
+              <w:right w:val="single" w:color="C9D8CE" w:sz="4"/>
+            </w:tcBorders>
+            <w:tcMar>
+              <w:top w:type="dxa" w:w="60"/>
+              <w:left w:type="dxa" w:w="90"/>
+              <w:bottom w:type="dxa" w:w="60"/>
+              <w:right w:type="dxa" w:w="90"/>
+            </w:tcMar>
+          </w:tcPr>
+          <w:p>
+            <w:r>
+              <w:rPr>
+                <w:b/>
+                <w:bCs/>
+                <w:color w:val="2E6B4F"/>
+                <w:sz w:val="19"/>
+                <w:szCs w:val="19"/>
+              </w:rPr>
+              <w:t xml:space="preserve">Real-world outcome</w:t>
+            </w:r>
+          </w:p>
+        </w:tc>
+        <w:tc>
+          <w:tcPr>
+            <w:tcW w:type="pct" w:w="7%"/>
             <w:tcBorders>
               <w:top w:val="single" w:color="C9D8CE" w:sz="4"/>
               <w:left w:val="single" w:color="C9D8CE" w:sz="4"/>
@@ -1408,7 +1558,7 @@
         </w:tc>
         <w:tc>
           <w:tcPr>
-            <w:tcW w:type="pct" w:w="8%"/>
+            <w:tcW w:type="pct" w:w="7%"/>
             <w:tcBorders>
               <w:top w:val="single" w:color="C9D8CE" w:sz="4"/>
               <w:left w:val="single" w:color="C9D8CE" w:sz="4"/>
@@ -1436,7 +1586,7 @@
         </w:tc>
         <w:tc>
           <w:tcPr>
-            <w:tcW w:type="pct" w:w="36%"/>
+            <w:tcW w:type="pct" w:w="30%"/>
             <w:tcBorders>
               <w:top w:val="single" w:color="C9D8CE" w:sz="4"/>
               <w:left w:val="single" w:color="C9D8CE" w:sz="4"/>
@@ -1669,6 +1819,21 @@
           <w:color w:val="2E6B4F"/>
         </w:rPr>
         <w:t xml:space="preserve">✓  No vanity metrics (high feasibility / low relevance) in the selection.</w:t>
+      </w:r>
+    </w:p>
+    <w:p>
+      <w:pPr>
+        <w:pStyle w:val="ListParagraph"/>
+        <w:numPr>
+          <w:ilvl w:val="0"/>
+          <w:numId w:val="1"/>
+        </w:numPr>
+      </w:pPr>
+      <w:r>
+        <w:rPr>
+          <w:color w:val="34608A"/>
+        </w:rPr>
+        <w:t xml:space="preserve">ℹ  The core set measures adoption but no real-world outcome yet. Adoption shows the product is used; an outcome indicator shows that use changes something.</w:t>
       </w:r>
     </w:p>
     <w:p>

</xml_diff>

<commit_message>
Module 4: evidence quality, baselines, sources and claim-evidence gaps
Keeps measured / modelled / projected and adds evidence quality as a
separate dimension. Each claim gains a baseline and evidence sources and
shows the assumption of the pathway step it relies on. A claim-evidence
check flags projected claims worded as fact, comparisons without a
baseline, low-quality measured claims, missing sources and contradictions
with step 2. Step 4 opens with a claims-and-evidence overview table, also
in report section 4 (renamed "Claims & Evidence"). Gaps feed the
integrity checks and next steps.

Word tables now use fixed column widths. FieldSense sample filled in.

Co-Authored-By: Claude Opus 5.5 <noreply@anthropic.com>
Claude-Session: https://claude.ai/code/session_01NsReyfcWBUffzS8XqtSvgs
</commit_message>
<xml_diff>
--- a/sample_reports/FieldSense_impact_report.docx
+++ b/sample_reports/FieldSense_impact_report.docx
@@ -672,7 +672,7 @@
     </w:p>
     <w:tbl>
       <w:tblPr>
-        <w:tblW w:type="pct" w:w="100%"/>
+        <w:tblW w:type="dxa" w:w="9000"/>
         <w:tblBorders>
           <w:top w:val="single" w:color="auto" w:sz="4"/>
           <w:left w:val="single" w:color="auto" w:sz="4"/>
@@ -681,14 +681,15 @@
           <w:insideH w:val="single" w:color="auto" w:sz="4"/>
           <w:insideV w:val="single" w:color="auto" w:sz="4"/>
         </w:tblBorders>
+        <w:tblLayout w:type="fixed"/>
       </w:tblPr>
       <w:tblGrid>
-        <w:gridCol w:w="100"/>
-        <w:gridCol w:w="100"/>
-        <w:gridCol w:w="100"/>
-        <w:gridCol w:w="100"/>
-        <w:gridCol w:w="100"/>
-        <w:gridCol w:w="100"/>
+        <w:gridCol w:w="2070"/>
+        <w:gridCol w:w="1260"/>
+        <w:gridCol w:w="1080"/>
+        <w:gridCol w:w="810"/>
+        <w:gridCol w:w="720"/>
+        <w:gridCol w:w="3060"/>
       </w:tblGrid>
       <w:tr>
         <w:trPr>
@@ -696,7 +697,7 @@
         </w:trPr>
         <w:tc>
           <w:tcPr>
-            <w:tcW w:type="pct" w:w="27%"/>
+            <w:tcW w:type="dxa" w:w="2070"/>
             <w:tcBorders>
               <w:top w:val="single" w:color="C9D8CE" w:sz="4"/>
               <w:left w:val="single" w:color="C9D8CE" w:sz="4"/>
@@ -726,7 +727,7 @@
         </w:tc>
         <w:tc>
           <w:tcPr>
-            <w:tcW w:type="pct" w:w="15%"/>
+            <w:tcW w:type="dxa" w:w="1260"/>
             <w:tcBorders>
               <w:top w:val="single" w:color="C9D8CE" w:sz="4"/>
               <w:left w:val="single" w:color="C9D8CE" w:sz="4"/>
@@ -756,7 +757,7 @@
         </w:tc>
         <w:tc>
           <w:tcPr>
-            <w:tcW w:type="pct" w:w="14%"/>
+            <w:tcW w:type="dxa" w:w="1080"/>
             <w:tcBorders>
               <w:top w:val="single" w:color="C9D8CE" w:sz="4"/>
               <w:left w:val="single" w:color="C9D8CE" w:sz="4"/>
@@ -786,7 +787,7 @@
         </w:tc>
         <w:tc>
           <w:tcPr>
-            <w:tcW w:type="pct" w:w="7%"/>
+            <w:tcW w:type="dxa" w:w="810"/>
             <w:tcBorders>
               <w:top w:val="single" w:color="C9D8CE" w:sz="4"/>
               <w:left w:val="single" w:color="C9D8CE" w:sz="4"/>
@@ -816,7 +817,7 @@
         </w:tc>
         <w:tc>
           <w:tcPr>
-            <w:tcW w:type="pct" w:w="7%"/>
+            <w:tcW w:type="dxa" w:w="720"/>
             <w:tcBorders>
               <w:top w:val="single" w:color="C9D8CE" w:sz="4"/>
               <w:left w:val="single" w:color="C9D8CE" w:sz="4"/>
@@ -846,7 +847,7 @@
         </w:tc>
         <w:tc>
           <w:tcPr>
-            <w:tcW w:type="pct" w:w="30%"/>
+            <w:tcW w:type="dxa" w:w="3060"/>
             <w:tcBorders>
               <w:top w:val="single" w:color="C9D8CE" w:sz="4"/>
               <w:left w:val="single" w:color="C9D8CE" w:sz="4"/>
@@ -878,7 +879,7 @@
       <w:tr>
         <w:tc>
           <w:tcPr>
-            <w:tcW w:type="pct" w:w="27%"/>
+            <w:tcW w:type="dxa" w:w="2070"/>
             <w:tcBorders>
               <w:top w:val="single" w:color="C9D8CE" w:sz="4"/>
               <w:left w:val="single" w:color="C9D8CE" w:sz="4"/>
@@ -906,7 +907,7 @@
         </w:tc>
         <w:tc>
           <w:tcPr>
-            <w:tcW w:type="pct" w:w="15%"/>
+            <w:tcW w:type="dxa" w:w="1260"/>
             <w:tcBorders>
               <w:top w:val="single" w:color="C9D8CE" w:sz="4"/>
               <w:left w:val="single" w:color="C9D8CE" w:sz="4"/>
@@ -934,7 +935,7 @@
         </w:tc>
         <w:tc>
           <w:tcPr>
-            <w:tcW w:type="pct" w:w="14%"/>
+            <w:tcW w:type="dxa" w:w="1080"/>
             <w:tcBorders>
               <w:top w:val="single" w:color="C9D8CE" w:sz="4"/>
               <w:left w:val="single" w:color="C9D8CE" w:sz="4"/>
@@ -963,7 +964,7 @@
         </w:tc>
         <w:tc>
           <w:tcPr>
-            <w:tcW w:type="pct" w:w="7%"/>
+            <w:tcW w:type="dxa" w:w="810"/>
             <w:tcBorders>
               <w:top w:val="single" w:color="C9D8CE" w:sz="4"/>
               <w:left w:val="single" w:color="C9D8CE" w:sz="4"/>
@@ -991,7 +992,7 @@
         </w:tc>
         <w:tc>
           <w:tcPr>
-            <w:tcW w:type="pct" w:w="7%"/>
+            <w:tcW w:type="dxa" w:w="720"/>
             <w:tcBorders>
               <w:top w:val="single" w:color="C9D8CE" w:sz="4"/>
               <w:left w:val="single" w:color="C9D8CE" w:sz="4"/>
@@ -1019,7 +1020,7 @@
         </w:tc>
         <w:tc>
           <w:tcPr>
-            <w:tcW w:type="pct" w:w="30%"/>
+            <w:tcW w:type="dxa" w:w="3060"/>
             <w:tcBorders>
               <w:top w:val="single" w:color="C9D8CE" w:sz="4"/>
               <w:left w:val="single" w:color="C9D8CE" w:sz="4"/>
@@ -1049,7 +1050,7 @@
       <w:tr>
         <w:tc>
           <w:tcPr>
-            <w:tcW w:type="pct" w:w="27%"/>
+            <w:tcW w:type="dxa" w:w="2070"/>
             <w:tcBorders>
               <w:top w:val="single" w:color="C9D8CE" w:sz="4"/>
               <w:left w:val="single" w:color="C9D8CE" w:sz="4"/>
@@ -1078,7 +1079,7 @@
         </w:tc>
         <w:tc>
           <w:tcPr>
-            <w:tcW w:type="pct" w:w="15%"/>
+            <w:tcW w:type="dxa" w:w="1260"/>
             <w:tcBorders>
               <w:top w:val="single" w:color="C9D8CE" w:sz="4"/>
               <w:left w:val="single" w:color="C9D8CE" w:sz="4"/>
@@ -1107,7 +1108,7 @@
         </w:tc>
         <w:tc>
           <w:tcPr>
-            <w:tcW w:type="pct" w:w="14%"/>
+            <w:tcW w:type="dxa" w:w="1080"/>
             <w:tcBorders>
               <w:top w:val="single" w:color="C9D8CE" w:sz="4"/>
               <w:left w:val="single" w:color="C9D8CE" w:sz="4"/>
@@ -1137,7 +1138,7 @@
         </w:tc>
         <w:tc>
           <w:tcPr>
-            <w:tcW w:type="pct" w:w="7%"/>
+            <w:tcW w:type="dxa" w:w="810"/>
             <w:tcBorders>
               <w:top w:val="single" w:color="C9D8CE" w:sz="4"/>
               <w:left w:val="single" w:color="C9D8CE" w:sz="4"/>
@@ -1166,7 +1167,7 @@
         </w:tc>
         <w:tc>
           <w:tcPr>
-            <w:tcW w:type="pct" w:w="7%"/>
+            <w:tcW w:type="dxa" w:w="720"/>
             <w:tcBorders>
               <w:top w:val="single" w:color="C9D8CE" w:sz="4"/>
               <w:left w:val="single" w:color="C9D8CE" w:sz="4"/>
@@ -1195,7 +1196,7 @@
         </w:tc>
         <w:tc>
           <w:tcPr>
-            <w:tcW w:type="pct" w:w="30%"/>
+            <w:tcW w:type="dxa" w:w="3060"/>
             <w:tcBorders>
               <w:top w:val="single" w:color="C9D8CE" w:sz="4"/>
               <w:left w:val="single" w:color="C9D8CE" w:sz="4"/>
@@ -1239,7 +1240,7 @@
     </w:p>
     <w:tbl>
       <w:tblPr>
-        <w:tblW w:type="pct" w:w="100%"/>
+        <w:tblW w:type="dxa" w:w="9000"/>
         <w:tblBorders>
           <w:top w:val="single" w:color="auto" w:sz="4"/>
           <w:left w:val="single" w:color="auto" w:sz="4"/>
@@ -1248,14 +1249,15 @@
           <w:insideH w:val="single" w:color="auto" w:sz="4"/>
           <w:insideV w:val="single" w:color="auto" w:sz="4"/>
         </w:tblBorders>
+        <w:tblLayout w:type="fixed"/>
       </w:tblPr>
       <w:tblGrid>
-        <w:gridCol w:w="100"/>
-        <w:gridCol w:w="100"/>
-        <w:gridCol w:w="100"/>
-        <w:gridCol w:w="100"/>
-        <w:gridCol w:w="100"/>
-        <w:gridCol w:w="100"/>
+        <w:gridCol w:w="2070"/>
+        <w:gridCol w:w="1260"/>
+        <w:gridCol w:w="1080"/>
+        <w:gridCol w:w="810"/>
+        <w:gridCol w:w="720"/>
+        <w:gridCol w:w="3060"/>
       </w:tblGrid>
       <w:tr>
         <w:trPr>
@@ -1263,7 +1265,7 @@
         </w:trPr>
         <w:tc>
           <w:tcPr>
-            <w:tcW w:type="pct" w:w="27%"/>
+            <w:tcW w:type="dxa" w:w="2070"/>
             <w:tcBorders>
               <w:top w:val="single" w:color="C9D8CE" w:sz="4"/>
               <w:left w:val="single" w:color="C9D8CE" w:sz="4"/>
@@ -1293,7 +1295,7 @@
         </w:tc>
         <w:tc>
           <w:tcPr>
-            <w:tcW w:type="pct" w:w="15%"/>
+            <w:tcW w:type="dxa" w:w="1260"/>
             <w:tcBorders>
               <w:top w:val="single" w:color="C9D8CE" w:sz="4"/>
               <w:left w:val="single" w:color="C9D8CE" w:sz="4"/>
@@ -1323,7 +1325,7 @@
         </w:tc>
         <w:tc>
           <w:tcPr>
-            <w:tcW w:type="pct" w:w="14%"/>
+            <w:tcW w:type="dxa" w:w="1080"/>
             <w:tcBorders>
               <w:top w:val="single" w:color="C9D8CE" w:sz="4"/>
               <w:left w:val="single" w:color="C9D8CE" w:sz="4"/>
@@ -1353,7 +1355,7 @@
         </w:tc>
         <w:tc>
           <w:tcPr>
-            <w:tcW w:type="pct" w:w="7%"/>
+            <w:tcW w:type="dxa" w:w="810"/>
             <w:tcBorders>
               <w:top w:val="single" w:color="C9D8CE" w:sz="4"/>
               <w:left w:val="single" w:color="C9D8CE" w:sz="4"/>
@@ -1383,7 +1385,7 @@
         </w:tc>
         <w:tc>
           <w:tcPr>
-            <w:tcW w:type="pct" w:w="7%"/>
+            <w:tcW w:type="dxa" w:w="720"/>
             <w:tcBorders>
               <w:top w:val="single" w:color="C9D8CE" w:sz="4"/>
               <w:left w:val="single" w:color="C9D8CE" w:sz="4"/>
@@ -1413,7 +1415,7 @@
         </w:tc>
         <w:tc>
           <w:tcPr>
-            <w:tcW w:type="pct" w:w="30%"/>
+            <w:tcW w:type="dxa" w:w="3060"/>
             <w:tcBorders>
               <w:top w:val="single" w:color="C9D8CE" w:sz="4"/>
               <w:left w:val="single" w:color="C9D8CE" w:sz="4"/>
@@ -1445,7 +1447,7 @@
       <w:tr>
         <w:tc>
           <w:tcPr>
-            <w:tcW w:type="pct" w:w="27%"/>
+            <w:tcW w:type="dxa" w:w="2070"/>
             <w:tcBorders>
               <w:top w:val="single" w:color="C9D8CE" w:sz="4"/>
               <w:left w:val="single" w:color="C9D8CE" w:sz="4"/>
@@ -1473,7 +1475,7 @@
         </w:tc>
         <w:tc>
           <w:tcPr>
-            <w:tcW w:type="pct" w:w="15%"/>
+            <w:tcW w:type="dxa" w:w="1260"/>
             <w:tcBorders>
               <w:top w:val="single" w:color="C9D8CE" w:sz="4"/>
               <w:left w:val="single" w:color="C9D8CE" w:sz="4"/>
@@ -1501,7 +1503,7 @@
         </w:tc>
         <w:tc>
           <w:tcPr>
-            <w:tcW w:type="pct" w:w="14%"/>
+            <w:tcW w:type="dxa" w:w="1080"/>
             <w:tcBorders>
               <w:top w:val="single" w:color="C9D8CE" w:sz="4"/>
               <w:left w:val="single" w:color="C9D8CE" w:sz="4"/>
@@ -1530,7 +1532,7 @@
         </w:tc>
         <w:tc>
           <w:tcPr>
-            <w:tcW w:type="pct" w:w="7%"/>
+            <w:tcW w:type="dxa" w:w="810"/>
             <w:tcBorders>
               <w:top w:val="single" w:color="C9D8CE" w:sz="4"/>
               <w:left w:val="single" w:color="C9D8CE" w:sz="4"/>
@@ -1558,7 +1560,7 @@
         </w:tc>
         <w:tc>
           <w:tcPr>
-            <w:tcW w:type="pct" w:w="7%"/>
+            <w:tcW w:type="dxa" w:w="720"/>
             <w:tcBorders>
               <w:top w:val="single" w:color="C9D8CE" w:sz="4"/>
               <w:left w:val="single" w:color="C9D8CE" w:sz="4"/>
@@ -1586,7 +1588,7 @@
         </w:tc>
         <w:tc>
           <w:tcPr>
-            <w:tcW w:type="pct" w:w="30%"/>
+            <w:tcW w:type="dxa" w:w="3060"/>
             <w:tcBorders>
               <w:top w:val="single" w:color="C9D8CE" w:sz="4"/>
               <w:left w:val="single" w:color="C9D8CE" w:sz="4"/>
@@ -1624,7 +1626,747 @@
         <w:pStyle w:val="Heading1"/>
       </w:pPr>
       <w:r>
-        <w:t xml:space="preserve">4. Uncertainty Acknowledgement</w:t>
+        <w:t xml:space="preserve">4. Claims &amp; Evidence</w:t>
+      </w:r>
+    </w:p>
+    <w:tbl>
+      <w:tblPr>
+        <w:tblW w:type="dxa" w:w="9000"/>
+        <w:tblBorders>
+          <w:top w:val="single" w:color="auto" w:sz="4"/>
+          <w:left w:val="single" w:color="auto" w:sz="4"/>
+          <w:bottom w:val="single" w:color="auto" w:sz="4"/>
+          <w:right w:val="single" w:color="auto" w:sz="4"/>
+          <w:insideH w:val="single" w:color="auto" w:sz="4"/>
+          <w:insideV w:val="single" w:color="auto" w:sz="4"/>
+        </w:tblBorders>
+        <w:tblLayout w:type="fixed"/>
+      </w:tblPr>
+      <w:tblGrid>
+        <w:gridCol w:w="3060"/>
+        <w:gridCol w:w="1170"/>
+        <w:gridCol w:w="1080"/>
+        <w:gridCol w:w="1080"/>
+        <w:gridCol w:w="1080"/>
+        <w:gridCol w:w="1530"/>
+      </w:tblGrid>
+      <w:tr>
+        <w:trPr>
+          <w:tblHeader/>
+        </w:trPr>
+        <w:tc>
+          <w:tcPr>
+            <w:tcW w:type="dxa" w:w="3060"/>
+            <w:tcBorders>
+              <w:top w:val="single" w:color="C9D8CE" w:sz="4"/>
+              <w:left w:val="single" w:color="C9D8CE" w:sz="4"/>
+              <w:bottom w:val="single" w:color="C9D8CE" w:sz="4"/>
+              <w:right w:val="single" w:color="C9D8CE" w:sz="4"/>
+            </w:tcBorders>
+            <w:shd w:fill="2E6B4F" w:color="auto" w:val="clear"/>
+            <w:tcMar>
+              <w:top w:type="dxa" w:w="60"/>
+              <w:left w:type="dxa" w:w="90"/>
+              <w:bottom w:type="dxa" w:w="60"/>
+              <w:right w:type="dxa" w:w="90"/>
+            </w:tcMar>
+          </w:tcPr>
+          <w:p>
+            <w:r>
+              <w:rPr>
+                <w:b/>
+                <w:bCs/>
+                <w:color w:val="FFFFFF"/>
+                <w:sz w:val="19"/>
+                <w:szCs w:val="19"/>
+              </w:rPr>
+              <w:t xml:space="preserve">Indicator and claim</w:t>
+            </w:r>
+          </w:p>
+        </w:tc>
+        <w:tc>
+          <w:tcPr>
+            <w:tcW w:type="dxa" w:w="1170"/>
+            <w:tcBorders>
+              <w:top w:val="single" w:color="C9D8CE" w:sz="4"/>
+              <w:left w:val="single" w:color="C9D8CE" w:sz="4"/>
+              <w:bottom w:val="single" w:color="C9D8CE" w:sz="4"/>
+              <w:right w:val="single" w:color="C9D8CE" w:sz="4"/>
+            </w:tcBorders>
+            <w:shd w:fill="2E6B4F" w:color="auto" w:val="clear"/>
+            <w:tcMar>
+              <w:top w:type="dxa" w:w="60"/>
+              <w:left w:type="dxa" w:w="90"/>
+              <w:bottom w:type="dxa" w:w="60"/>
+              <w:right w:type="dxa" w:w="90"/>
+            </w:tcMar>
+          </w:tcPr>
+          <w:p>
+            <w:r>
+              <w:rPr>
+                <w:b/>
+                <w:bCs/>
+                <w:color w:val="FFFFFF"/>
+                <w:sz w:val="19"/>
+                <w:szCs w:val="19"/>
+              </w:rPr>
+              <w:t xml:space="preserve">Level</w:t>
+            </w:r>
+          </w:p>
+        </w:tc>
+        <w:tc>
+          <w:tcPr>
+            <w:tcW w:type="dxa" w:w="1080"/>
+            <w:tcBorders>
+              <w:top w:val="single" w:color="C9D8CE" w:sz="4"/>
+              <w:left w:val="single" w:color="C9D8CE" w:sz="4"/>
+              <w:bottom w:val="single" w:color="C9D8CE" w:sz="4"/>
+              <w:right w:val="single" w:color="C9D8CE" w:sz="4"/>
+            </w:tcBorders>
+            <w:shd w:fill="2E6B4F" w:color="auto" w:val="clear"/>
+            <w:tcMar>
+              <w:top w:type="dxa" w:w="60"/>
+              <w:left w:type="dxa" w:w="90"/>
+              <w:bottom w:type="dxa" w:w="60"/>
+              <w:right w:type="dxa" w:w="90"/>
+            </w:tcMar>
+          </w:tcPr>
+          <w:p>
+            <w:r>
+              <w:rPr>
+                <w:b/>
+                <w:bCs/>
+                <w:color w:val="FFFFFF"/>
+                <w:sz w:val="19"/>
+                <w:szCs w:val="19"/>
+              </w:rPr>
+              <w:t xml:space="preserve">Quality</w:t>
+            </w:r>
+          </w:p>
+        </w:tc>
+        <w:tc>
+          <w:tcPr>
+            <w:tcW w:type="dxa" w:w="1080"/>
+            <w:tcBorders>
+              <w:top w:val="single" w:color="C9D8CE" w:sz="4"/>
+              <w:left w:val="single" w:color="C9D8CE" w:sz="4"/>
+              <w:bottom w:val="single" w:color="C9D8CE" w:sz="4"/>
+              <w:right w:val="single" w:color="C9D8CE" w:sz="4"/>
+            </w:tcBorders>
+            <w:shd w:fill="2E6B4F" w:color="auto" w:val="clear"/>
+            <w:tcMar>
+              <w:top w:type="dxa" w:w="60"/>
+              <w:left w:type="dxa" w:w="90"/>
+              <w:bottom w:type="dxa" w:w="60"/>
+              <w:right w:type="dxa" w:w="90"/>
+            </w:tcMar>
+          </w:tcPr>
+          <w:p>
+            <w:r>
+              <w:rPr>
+                <w:b/>
+                <w:bCs/>
+                <w:color w:val="FFFFFF"/>
+                <w:sz w:val="19"/>
+                <w:szCs w:val="19"/>
+              </w:rPr>
+              <w:t xml:space="preserve">Baseline</w:t>
+            </w:r>
+          </w:p>
+        </w:tc>
+        <w:tc>
+          <w:tcPr>
+            <w:tcW w:type="dxa" w:w="1080"/>
+            <w:tcBorders>
+              <w:top w:val="single" w:color="C9D8CE" w:sz="4"/>
+              <w:left w:val="single" w:color="C9D8CE" w:sz="4"/>
+              <w:bottom w:val="single" w:color="C9D8CE" w:sz="4"/>
+              <w:right w:val="single" w:color="C9D8CE" w:sz="4"/>
+            </w:tcBorders>
+            <w:shd w:fill="2E6B4F" w:color="auto" w:val="clear"/>
+            <w:tcMar>
+              <w:top w:type="dxa" w:w="60"/>
+              <w:left w:type="dxa" w:w="90"/>
+              <w:bottom w:type="dxa" w:w="60"/>
+              <w:right w:type="dxa" w:w="90"/>
+            </w:tcMar>
+          </w:tcPr>
+          <w:p>
+            <w:r>
+              <w:rPr>
+                <w:b/>
+                <w:bCs/>
+                <w:color w:val="FFFFFF"/>
+                <w:sz w:val="19"/>
+                <w:szCs w:val="19"/>
+              </w:rPr>
+              <w:t xml:space="preserve">Sources</w:t>
+            </w:r>
+          </w:p>
+        </w:tc>
+        <w:tc>
+          <w:tcPr>
+            <w:tcW w:type="dxa" w:w="1530"/>
+            <w:tcBorders>
+              <w:top w:val="single" w:color="C9D8CE" w:sz="4"/>
+              <w:left w:val="single" w:color="C9D8CE" w:sz="4"/>
+              <w:bottom w:val="single" w:color="C9D8CE" w:sz="4"/>
+              <w:right w:val="single" w:color="C9D8CE" w:sz="4"/>
+            </w:tcBorders>
+            <w:shd w:fill="2E6B4F" w:color="auto" w:val="clear"/>
+            <w:tcMar>
+              <w:top w:type="dxa" w:w="60"/>
+              <w:left w:type="dxa" w:w="90"/>
+              <w:bottom w:type="dxa" w:w="60"/>
+              <w:right w:type="dxa" w:w="90"/>
+            </w:tcMar>
+          </w:tcPr>
+          <w:p>
+            <w:r>
+              <w:rPr>
+                <w:b/>
+                <w:bCs/>
+                <w:color w:val="FFFFFF"/>
+                <w:sz w:val="19"/>
+                <w:szCs w:val="19"/>
+              </w:rPr>
+              <w:t xml:space="preserve">Gaps</w:t>
+            </w:r>
+          </w:p>
+        </w:tc>
+      </w:tr>
+      <w:tr>
+        <w:tc>
+          <w:tcPr>
+            <w:tcW w:type="dxa" w:w="3060"/>
+            <w:tcBorders>
+              <w:top w:val="single" w:color="C9D8CE" w:sz="4"/>
+              <w:left w:val="single" w:color="C9D8CE" w:sz="4"/>
+              <w:bottom w:val="single" w:color="C9D8CE" w:sz="4"/>
+              <w:right w:val="single" w:color="C9D8CE" w:sz="4"/>
+            </w:tcBorders>
+            <w:tcMar>
+              <w:top w:type="dxa" w:w="60"/>
+              <w:left w:type="dxa" w:w="90"/>
+              <w:bottom w:type="dxa" w:w="60"/>
+              <w:right w:type="dxa" w:w="90"/>
+            </w:tcMar>
+          </w:tcPr>
+          <w:p>
+            <w:r>
+              <w:rPr>
+                <w:b w:val="false"/>
+                <w:bCs w:val="false"/>
+                <w:sz w:val="19"/>
+                <w:szCs w:val="19"/>
+              </w:rPr>
+              <w:t xml:space="preserve">Adoption rate of the solution — “62 enrolled farms covering approximately 410 hectares as of this month.”</w:t>
+            </w:r>
+          </w:p>
+        </w:tc>
+        <w:tc>
+          <w:tcPr>
+            <w:tcW w:type="dxa" w:w="1170"/>
+            <w:tcBorders>
+              <w:top w:val="single" w:color="C9D8CE" w:sz="4"/>
+              <w:left w:val="single" w:color="C9D8CE" w:sz="4"/>
+              <w:bottom w:val="single" w:color="C9D8CE" w:sz="4"/>
+              <w:right w:val="single" w:color="C9D8CE" w:sz="4"/>
+            </w:tcBorders>
+            <w:tcMar>
+              <w:top w:type="dxa" w:w="60"/>
+              <w:left w:type="dxa" w:w="90"/>
+              <w:bottom w:type="dxa" w:w="60"/>
+              <w:right w:type="dxa" w:w="90"/>
+            </w:tcMar>
+          </w:tcPr>
+          <w:p>
+            <w:r>
+              <w:rPr>
+                <w:b/>
+                <w:bCs/>
+                <w:color w:val="2E6B4F"/>
+                <w:sz w:val="19"/>
+                <w:szCs w:val="19"/>
+              </w:rPr>
+              <w:t xml:space="preserve">Measured</w:t>
+            </w:r>
+          </w:p>
+        </w:tc>
+        <w:tc>
+          <w:tcPr>
+            <w:tcW w:type="dxa" w:w="1080"/>
+            <w:tcBorders>
+              <w:top w:val="single" w:color="C9D8CE" w:sz="4"/>
+              <w:left w:val="single" w:color="C9D8CE" w:sz="4"/>
+              <w:bottom w:val="single" w:color="C9D8CE" w:sz="4"/>
+              <w:right w:val="single" w:color="C9D8CE" w:sz="4"/>
+            </w:tcBorders>
+            <w:tcMar>
+              <w:top w:type="dxa" w:w="60"/>
+              <w:left w:type="dxa" w:w="90"/>
+              <w:bottom w:type="dxa" w:w="60"/>
+              <w:right w:type="dxa" w:w="90"/>
+            </w:tcMar>
+          </w:tcPr>
+          <w:p>
+            <w:r>
+              <w:rPr>
+                <w:b w:val="false"/>
+                <w:bCs w:val="false"/>
+                <w:sz w:val="19"/>
+                <w:szCs w:val="19"/>
+              </w:rPr>
+              <w:t xml:space="preserve">High</w:t>
+            </w:r>
+          </w:p>
+        </w:tc>
+        <w:tc>
+          <w:tcPr>
+            <w:tcW w:type="dxa" w:w="1080"/>
+            <w:tcBorders>
+              <w:top w:val="single" w:color="C9D8CE" w:sz="4"/>
+              <w:left w:val="single" w:color="C9D8CE" w:sz="4"/>
+              <w:bottom w:val="single" w:color="C9D8CE" w:sz="4"/>
+              <w:right w:val="single" w:color="C9D8CE" w:sz="4"/>
+            </w:tcBorders>
+            <w:tcMar>
+              <w:top w:type="dxa" w:w="60"/>
+              <w:left w:type="dxa" w:w="90"/>
+              <w:bottom w:type="dxa" w:w="60"/>
+              <w:right w:type="dxa" w:w="90"/>
+            </w:tcMar>
+          </w:tcPr>
+          <w:p>
+            <w:r>
+              <w:rPr>
+                <w:b w:val="false"/>
+                <w:bCs w:val="false"/>
+                <w:color w:val="5A6B62"/>
+                <w:sz w:val="19"/>
+                <w:szCs w:val="19"/>
+              </w:rPr>
+              <w:t xml:space="preserve">not needed</w:t>
+            </w:r>
+          </w:p>
+        </w:tc>
+        <w:tc>
+          <w:tcPr>
+            <w:tcW w:type="dxa" w:w="1080"/>
+            <w:tcBorders>
+              <w:top w:val="single" w:color="C9D8CE" w:sz="4"/>
+              <w:left w:val="single" w:color="C9D8CE" w:sz="4"/>
+              <w:bottom w:val="single" w:color="C9D8CE" w:sz="4"/>
+              <w:right w:val="single" w:color="C9D8CE" w:sz="4"/>
+            </w:tcBorders>
+            <w:tcMar>
+              <w:top w:type="dxa" w:w="60"/>
+              <w:left w:type="dxa" w:w="90"/>
+              <w:bottom w:type="dxa" w:w="60"/>
+              <w:right w:type="dxa" w:w="90"/>
+            </w:tcMar>
+          </w:tcPr>
+          <w:p>
+            <w:r>
+              <w:rPr>
+                <w:b w:val="false"/>
+                <w:bCs w:val="false"/>
+                <w:color w:val="2E6B4F"/>
+                <w:sz w:val="19"/>
+                <w:szCs w:val="19"/>
+              </w:rPr>
+              <w:t xml:space="preserve">✓</w:t>
+            </w:r>
+          </w:p>
+        </w:tc>
+        <w:tc>
+          <w:tcPr>
+            <w:tcW w:type="dxa" w:w="1530"/>
+            <w:tcBorders>
+              <w:top w:val="single" w:color="C9D8CE" w:sz="4"/>
+              <w:left w:val="single" w:color="C9D8CE" w:sz="4"/>
+              <w:bottom w:val="single" w:color="C9D8CE" w:sz="4"/>
+              <w:right w:val="single" w:color="C9D8CE" w:sz="4"/>
+            </w:tcBorders>
+            <w:tcMar>
+              <w:top w:type="dxa" w:w="60"/>
+              <w:left w:type="dxa" w:w="90"/>
+              <w:bottom w:type="dxa" w:w="60"/>
+              <w:right w:type="dxa" w:w="90"/>
+            </w:tcMar>
+          </w:tcPr>
+          <w:p>
+            <w:r>
+              <w:rPr>
+                <w:b w:val="false"/>
+                <w:bCs w:val="false"/>
+                <w:color w:val="2E6B4F"/>
+                <w:sz w:val="19"/>
+                <w:szCs w:val="19"/>
+              </w:rPr>
+              <w:t xml:space="preserve">none</w:t>
+            </w:r>
+          </w:p>
+        </w:tc>
+      </w:tr>
+      <w:tr>
+        <w:tc>
+          <w:tcPr>
+            <w:tcW w:type="dxa" w:w="3060"/>
+            <w:tcBorders>
+              <w:top w:val="single" w:color="C9D8CE" w:sz="4"/>
+              <w:left w:val="single" w:color="C9D8CE" w:sz="4"/>
+              <w:bottom w:val="single" w:color="C9D8CE" w:sz="4"/>
+              <w:right w:val="single" w:color="C9D8CE" w:sz="4"/>
+            </w:tcBorders>
+            <w:shd w:fill="EAF2ED" w:color="auto" w:val="clear"/>
+            <w:tcMar>
+              <w:top w:type="dxa" w:w="60"/>
+              <w:left w:type="dxa" w:w="90"/>
+              <w:bottom w:type="dxa" w:w="60"/>
+              <w:right w:type="dxa" w:w="90"/>
+            </w:tcMar>
+          </w:tcPr>
+          <w:p>
+            <w:r>
+              <w:rPr>
+                <w:b w:val="false"/>
+                <w:bCs w:val="false"/>
+                <w:sz w:val="19"/>
+                <w:szCs w:val="19"/>
+              </w:rPr>
+              <w:t xml:space="preserve">Quality / reliability of adoption evidence — “71% of surveyed farmers self-report reduced irrigation frequency.”</w:t>
+            </w:r>
+          </w:p>
+        </w:tc>
+        <w:tc>
+          <w:tcPr>
+            <w:tcW w:type="dxa" w:w="1170"/>
+            <w:tcBorders>
+              <w:top w:val="single" w:color="C9D8CE" w:sz="4"/>
+              <w:left w:val="single" w:color="C9D8CE" w:sz="4"/>
+              <w:bottom w:val="single" w:color="C9D8CE" w:sz="4"/>
+              <w:right w:val="single" w:color="C9D8CE" w:sz="4"/>
+            </w:tcBorders>
+            <w:shd w:fill="EAF2ED" w:color="auto" w:val="clear"/>
+            <w:tcMar>
+              <w:top w:type="dxa" w:w="60"/>
+              <w:left w:type="dxa" w:w="90"/>
+              <w:bottom w:type="dxa" w:w="60"/>
+              <w:right w:type="dxa" w:w="90"/>
+            </w:tcMar>
+          </w:tcPr>
+          <w:p>
+            <w:r>
+              <w:rPr>
+                <w:b/>
+                <w:bCs/>
+                <w:color w:val="B8860B"/>
+                <w:sz w:val="19"/>
+                <w:szCs w:val="19"/>
+              </w:rPr>
+              <w:t xml:space="preserve">Modelled</w:t>
+            </w:r>
+          </w:p>
+        </w:tc>
+        <w:tc>
+          <w:tcPr>
+            <w:tcW w:type="dxa" w:w="1080"/>
+            <w:tcBorders>
+              <w:top w:val="single" w:color="C9D8CE" w:sz="4"/>
+              <w:left w:val="single" w:color="C9D8CE" w:sz="4"/>
+              <w:bottom w:val="single" w:color="C9D8CE" w:sz="4"/>
+              <w:right w:val="single" w:color="C9D8CE" w:sz="4"/>
+            </w:tcBorders>
+            <w:shd w:fill="EAF2ED" w:color="auto" w:val="clear"/>
+            <w:tcMar>
+              <w:top w:type="dxa" w:w="60"/>
+              <w:left w:type="dxa" w:w="90"/>
+              <w:bottom w:type="dxa" w:w="60"/>
+              <w:right w:type="dxa" w:w="90"/>
+            </w:tcMar>
+          </w:tcPr>
+          <w:p>
+            <w:r>
+              <w:rPr>
+                <w:b w:val="false"/>
+                <w:bCs w:val="false"/>
+                <w:sz w:val="19"/>
+                <w:szCs w:val="19"/>
+              </w:rPr>
+              <w:t xml:space="preserve">Low</w:t>
+            </w:r>
+          </w:p>
+        </w:tc>
+        <w:tc>
+          <w:tcPr>
+            <w:tcW w:type="dxa" w:w="1080"/>
+            <w:tcBorders>
+              <w:top w:val="single" w:color="C9D8CE" w:sz="4"/>
+              <w:left w:val="single" w:color="C9D8CE" w:sz="4"/>
+              <w:bottom w:val="single" w:color="C9D8CE" w:sz="4"/>
+              <w:right w:val="single" w:color="C9D8CE" w:sz="4"/>
+            </w:tcBorders>
+            <w:shd w:fill="EAF2ED" w:color="auto" w:val="clear"/>
+            <w:tcMar>
+              <w:top w:type="dxa" w:w="60"/>
+              <w:left w:type="dxa" w:w="90"/>
+              <w:bottom w:type="dxa" w:w="60"/>
+              <w:right w:type="dxa" w:w="90"/>
+            </w:tcMar>
+          </w:tcPr>
+          <w:p>
+            <w:r>
+              <w:rPr>
+                <w:b w:val="false"/>
+                <w:bCs w:val="false"/>
+                <w:color w:val="2E6B4F"/>
+                <w:sz w:val="19"/>
+                <w:szCs w:val="19"/>
+              </w:rPr>
+              <w:t xml:space="preserve">✓</w:t>
+            </w:r>
+          </w:p>
+        </w:tc>
+        <w:tc>
+          <w:tcPr>
+            <w:tcW w:type="dxa" w:w="1080"/>
+            <w:tcBorders>
+              <w:top w:val="single" w:color="C9D8CE" w:sz="4"/>
+              <w:left w:val="single" w:color="C9D8CE" w:sz="4"/>
+              <w:bottom w:val="single" w:color="C9D8CE" w:sz="4"/>
+              <w:right w:val="single" w:color="C9D8CE" w:sz="4"/>
+            </w:tcBorders>
+            <w:shd w:fill="EAF2ED" w:color="auto" w:val="clear"/>
+            <w:tcMar>
+              <w:top w:type="dxa" w:w="60"/>
+              <w:left w:type="dxa" w:w="90"/>
+              <w:bottom w:type="dxa" w:w="60"/>
+              <w:right w:type="dxa" w:w="90"/>
+            </w:tcMar>
+          </w:tcPr>
+          <w:p>
+            <w:r>
+              <w:rPr>
+                <w:b w:val="false"/>
+                <w:bCs w:val="false"/>
+                <w:color w:val="2E6B4F"/>
+                <w:sz w:val="19"/>
+                <w:szCs w:val="19"/>
+              </w:rPr>
+              <w:t xml:space="preserve">✓</w:t>
+            </w:r>
+          </w:p>
+        </w:tc>
+        <w:tc>
+          <w:tcPr>
+            <w:tcW w:type="dxa" w:w="1530"/>
+            <w:tcBorders>
+              <w:top w:val="single" w:color="C9D8CE" w:sz="4"/>
+              <w:left w:val="single" w:color="C9D8CE" w:sz="4"/>
+              <w:bottom w:val="single" w:color="C9D8CE" w:sz="4"/>
+              <w:right w:val="single" w:color="C9D8CE" w:sz="4"/>
+            </w:tcBorders>
+            <w:shd w:fill="EAF2ED" w:color="auto" w:val="clear"/>
+            <w:tcMar>
+              <w:top w:type="dxa" w:w="60"/>
+              <w:left w:type="dxa" w:w="90"/>
+              <w:bottom w:type="dxa" w:w="60"/>
+              <w:right w:type="dxa" w:w="90"/>
+            </w:tcMar>
+          </w:tcPr>
+          <w:p>
+            <w:r>
+              <w:rPr>
+                <w:b w:val="false"/>
+                <w:bCs w:val="false"/>
+                <w:color w:val="2E6B4F"/>
+                <w:sz w:val="19"/>
+                <w:szCs w:val="19"/>
+              </w:rPr>
+              <w:t xml:space="preserve">none</w:t>
+            </w:r>
+          </w:p>
+        </w:tc>
+      </w:tr>
+      <w:tr>
+        <w:tc>
+          <w:tcPr>
+            <w:tcW w:type="dxa" w:w="3060"/>
+            <w:tcBorders>
+              <w:top w:val="single" w:color="C9D8CE" w:sz="4"/>
+              <w:left w:val="single" w:color="C9D8CE" w:sz="4"/>
+              <w:bottom w:val="single" w:color="C9D8CE" w:sz="4"/>
+              <w:right w:val="single" w:color="C9D8CE" w:sz="4"/>
+            </w:tcBorders>
+            <w:tcMar>
+              <w:top w:type="dxa" w:w="60"/>
+              <w:left w:type="dxa" w:w="90"/>
+              <w:bottom w:type="dxa" w:w="60"/>
+              <w:right w:type="dxa" w:w="90"/>
+            </w:tcMar>
+          </w:tcPr>
+          <w:p>
+            <w:r>
+              <w:rPr>
+                <w:b w:val="false"/>
+                <w:bCs w:val="false"/>
+                <w:sz w:val="19"/>
+                <w:szCs w:val="19"/>
+              </w:rPr>
+              <w:t xml:space="preserve">Avoided physical harm per unit of adoption (domain-specific) — “We estimate an approximate 18% reduction in water withdrawal per irrigated hectare versus the regional baseline.”</w:t>
+            </w:r>
+          </w:p>
+        </w:tc>
+        <w:tc>
+          <w:tcPr>
+            <w:tcW w:type="dxa" w:w="1170"/>
+            <w:tcBorders>
+              <w:top w:val="single" w:color="C9D8CE" w:sz="4"/>
+              <w:left w:val="single" w:color="C9D8CE" w:sz="4"/>
+              <w:bottom w:val="single" w:color="C9D8CE" w:sz="4"/>
+              <w:right w:val="single" w:color="C9D8CE" w:sz="4"/>
+            </w:tcBorders>
+            <w:tcMar>
+              <w:top w:type="dxa" w:w="60"/>
+              <w:left w:type="dxa" w:w="90"/>
+              <w:bottom w:type="dxa" w:w="60"/>
+              <w:right w:type="dxa" w:w="90"/>
+            </w:tcMar>
+          </w:tcPr>
+          <w:p>
+            <w:r>
+              <w:rPr>
+                <w:b/>
+                <w:bCs/>
+                <w:color w:val="8A5A9E"/>
+                <w:sz w:val="19"/>
+                <w:szCs w:val="19"/>
+              </w:rPr>
+              <w:t xml:space="preserve">Projected</w:t>
+            </w:r>
+          </w:p>
+        </w:tc>
+        <w:tc>
+          <w:tcPr>
+            <w:tcW w:type="dxa" w:w="1080"/>
+            <w:tcBorders>
+              <w:top w:val="single" w:color="C9D8CE" w:sz="4"/>
+              <w:left w:val="single" w:color="C9D8CE" w:sz="4"/>
+              <w:bottom w:val="single" w:color="C9D8CE" w:sz="4"/>
+              <w:right w:val="single" w:color="C9D8CE" w:sz="4"/>
+            </w:tcBorders>
+            <w:tcMar>
+              <w:top w:type="dxa" w:w="60"/>
+              <w:left w:type="dxa" w:w="90"/>
+              <w:bottom w:type="dxa" w:w="60"/>
+              <w:right w:type="dxa" w:w="90"/>
+            </w:tcMar>
+          </w:tcPr>
+          <w:p>
+            <w:r>
+              <w:rPr>
+                <w:b w:val="false"/>
+                <w:bCs w:val="false"/>
+                <w:sz w:val="19"/>
+                <w:szCs w:val="19"/>
+              </w:rPr>
+              <w:t xml:space="preserve">Medium</w:t>
+            </w:r>
+          </w:p>
+        </w:tc>
+        <w:tc>
+          <w:tcPr>
+            <w:tcW w:type="dxa" w:w="1080"/>
+            <w:tcBorders>
+              <w:top w:val="single" w:color="C9D8CE" w:sz="4"/>
+              <w:left w:val="single" w:color="C9D8CE" w:sz="4"/>
+              <w:bottom w:val="single" w:color="C9D8CE" w:sz="4"/>
+              <w:right w:val="single" w:color="C9D8CE" w:sz="4"/>
+            </w:tcBorders>
+            <w:tcMar>
+              <w:top w:type="dxa" w:w="60"/>
+              <w:left w:type="dxa" w:w="90"/>
+              <w:bottom w:type="dxa" w:w="60"/>
+              <w:right w:type="dxa" w:w="90"/>
+            </w:tcMar>
+          </w:tcPr>
+          <w:p>
+            <w:r>
+              <w:rPr>
+                <w:b w:val="false"/>
+                <w:bCs w:val="false"/>
+                <w:color w:val="2E6B4F"/>
+                <w:sz w:val="19"/>
+                <w:szCs w:val="19"/>
+              </w:rPr>
+              <w:t xml:space="preserve">✓</w:t>
+            </w:r>
+          </w:p>
+        </w:tc>
+        <w:tc>
+          <w:tcPr>
+            <w:tcW w:type="dxa" w:w="1080"/>
+            <w:tcBorders>
+              <w:top w:val="single" w:color="C9D8CE" w:sz="4"/>
+              <w:left w:val="single" w:color="C9D8CE" w:sz="4"/>
+              <w:bottom w:val="single" w:color="C9D8CE" w:sz="4"/>
+              <w:right w:val="single" w:color="C9D8CE" w:sz="4"/>
+            </w:tcBorders>
+            <w:tcMar>
+              <w:top w:type="dxa" w:w="60"/>
+              <w:left w:type="dxa" w:w="90"/>
+              <w:bottom w:type="dxa" w:w="60"/>
+              <w:right w:type="dxa" w:w="90"/>
+            </w:tcMar>
+          </w:tcPr>
+          <w:p>
+            <w:r>
+              <w:rPr>
+                <w:b w:val="false"/>
+                <w:bCs w:val="false"/>
+                <w:color w:val="2E6B4F"/>
+                <w:sz w:val="19"/>
+                <w:szCs w:val="19"/>
+              </w:rPr>
+              <w:t xml:space="preserve">✓</w:t>
+            </w:r>
+          </w:p>
+        </w:tc>
+        <w:tc>
+          <w:tcPr>
+            <w:tcW w:type="dxa" w:w="1530"/>
+            <w:tcBorders>
+              <w:top w:val="single" w:color="C9D8CE" w:sz="4"/>
+              <w:left w:val="single" w:color="C9D8CE" w:sz="4"/>
+              <w:bottom w:val="single" w:color="C9D8CE" w:sz="4"/>
+              <w:right w:val="single" w:color="C9D8CE" w:sz="4"/>
+            </w:tcBorders>
+            <w:tcMar>
+              <w:top w:type="dxa" w:w="60"/>
+              <w:left w:type="dxa" w:w="90"/>
+              <w:bottom w:type="dxa" w:w="60"/>
+              <w:right w:type="dxa" w:w="90"/>
+            </w:tcMar>
+          </w:tcPr>
+          <w:p>
+            <w:r>
+              <w:rPr>
+                <w:b w:val="false"/>
+                <w:bCs w:val="false"/>
+                <w:color w:val="2E6B4F"/>
+                <w:sz w:val="19"/>
+                <w:szCs w:val="19"/>
+              </w:rPr>
+              <w:t xml:space="preserve">none</w:t>
+            </w:r>
+          </w:p>
+        </w:tc>
+      </w:tr>
+    </w:tbl>
+    <w:p>
+      <w:r>
+        <w:t xml:space="preserve"/>
       </w:r>
     </w:p>
     <w:p>
@@ -1642,6 +2384,14 @@
         </w:rPr>
         <w:t xml:space="preserve">  [MEASURED]</w:t>
       </w:r>
+      <w:r>
+        <w:rPr>
+          <w:b/>
+          <w:bCs/>
+          <w:color w:val="5A6B62"/>
+        </w:rPr>
+        <w:t xml:space="preserve">  [QUALITY: HIGH]</w:t>
+      </w:r>
     </w:p>
     <w:p>
       <w:r>
@@ -1661,10 +2411,46 @@
           <w:b/>
           <w:bCs/>
         </w:rPr>
-        <w:t xml:space="preserve">Assumptions &amp; data sources: </w:t>
-      </w:r>
-      <w:r>
-        <w:t xml:space="preserve">CRM enrollment and onboarding records.</w:t>
+        <w:t xml:space="preserve">Baseline: </w:t>
+      </w:r>
+      <w:r>
+        <w:t xml:space="preserve">(not stated)</w:t>
+      </w:r>
+    </w:p>
+    <w:p>
+      <w:r>
+        <w:rPr>
+          <w:b/>
+          <w:bCs/>
+        </w:rPr>
+        <w:t xml:space="preserve">Evidence and data sources: </w:t>
+      </w:r>
+      <w:r>
+        <w:t xml:space="preserve">CRM enrollment and onboarding records</w:t>
+      </w:r>
+    </w:p>
+    <w:p>
+      <w:r>
+        <w:rPr>
+          <w:b/>
+          <w:bCs/>
+        </w:rPr>
+        <w:t xml:space="preserve">Relies on pathway step: </w:t>
+      </w:r>
+      <w:r>
+        <w:t xml:space="preserve">Adoption chain → Outputs: customer adoption. Assumption: Enrolled farms are reasonably representative of typical smallholder operations in the region, not just early-adopter outliers. (evidence: Moderate (some evidence))</w:t>
+      </w:r>
+    </w:p>
+    <w:p>
+      <w:r>
+        <w:rPr>
+          <w:b/>
+          <w:bCs/>
+        </w:rPr>
+        <w:t xml:space="preserve">Assumptions: </w:t>
+      </w:r>
+      <w:r>
+        <w:t xml:space="preserve">Counts farms that are enrolled and have sensors installed; enrollment alone does not show that a farm actively uses the recommendations.</w:t>
       </w:r>
     </w:p>
     <w:p>
@@ -1694,6 +2480,14 @@
         </w:rPr>
         <w:t xml:space="preserve">  [MODELLED]</w:t>
       </w:r>
+      <w:r>
+        <w:rPr>
+          <w:b/>
+          <w:bCs/>
+          <w:color w:val="5A6B62"/>
+        </w:rPr>
+        <w:t xml:space="preserve">  [QUALITY: LOW]</w:t>
+      </w:r>
     </w:p>
     <w:p>
       <w:r>
@@ -1713,10 +2507,46 @@
           <w:b/>
           <w:bCs/>
         </w:rPr>
-        <w:t xml:space="preserve">Assumptions &amp; data sources: </w:t>
-      </w:r>
-      <w:r>
-        <w:t xml:space="preserve">Self-reported survey of 22 of 62 enrolled farms; social-desirability bias likely inflates positive responses somewhat.</w:t>
+        <w:t xml:space="preserve">Baseline: </w:t>
+      </w:r>
+      <w:r>
+        <w:t xml:space="preserve">Farmers' own recollection of how often they irrigated before using FieldSense</w:t>
+      </w:r>
+    </w:p>
+    <w:p>
+      <w:r>
+        <w:rPr>
+          <w:b/>
+          <w:bCs/>
+        </w:rPr>
+        <w:t xml:space="preserve">Evidence and data sources: </w:t>
+      </w:r>
+      <w:r>
+        <w:t xml:space="preserve">Self-reported survey of 22 of 62 enrolled farms</w:t>
+      </w:r>
+    </w:p>
+    <w:p>
+      <w:r>
+        <w:rPr>
+          <w:b/>
+          <w:bCs/>
+        </w:rPr>
+        <w:t xml:space="preserve">Relies on pathway step: </w:t>
+      </w:r>
+      <w:r>
+        <w:t xml:space="preserve">Adoption chain → Outcomes: customer behavior change. Assumption: App engagement actually translates into reduced water applied, not just reduced perceived need to water. (evidence: Weak (assumption only))</w:t>
+      </w:r>
+    </w:p>
+    <w:p>
+      <w:r>
+        <w:rPr>
+          <w:b/>
+          <w:bCs/>
+        </w:rPr>
+        <w:t xml:space="preserve">Assumptions: </w:t>
+      </w:r>
+      <w:r>
+        <w:t xml:space="preserve">Social-desirability bias likely inflates positive responses somewhat; irrigating less often does not necessarily mean using less water.</w:t>
       </w:r>
     </w:p>
     <w:p>
@@ -1733,6 +2563,21 @@
     </w:p>
     <w:p>
       <w:pPr>
+        <w:pStyle w:val="ListParagraph"/>
+        <w:numPr>
+          <w:ilvl w:val="0"/>
+          <w:numId w:val="1"/>
+        </w:numPr>
+      </w:pPr>
+      <w:r>
+        <w:rPr>
+          <w:color w:val="34608A"/>
+        </w:rPr>
+        <w:t xml:space="preserve">ℹ The claim is modelled; say so in the wording (e.g. “an estimated …”).</w:t>
+      </w:r>
+    </w:p>
+    <w:p>
+      <w:pPr>
         <w:pStyle w:val="Heading3"/>
       </w:pPr>
       <w:r>
@@ -1746,6 +2591,14 @@
         </w:rPr>
         <w:t xml:space="preserve">  [PROJECTED]</w:t>
       </w:r>
+      <w:r>
+        <w:rPr>
+          <w:b/>
+          <w:bCs/>
+          <w:color w:val="5A6B62"/>
+        </w:rPr>
+        <w:t xml:space="preserve">  [QUALITY: MEDIUM]</w:t>
+      </w:r>
     </w:p>
     <w:p>
       <w:r>
@@ -1765,10 +2618,46 @@
           <w:b/>
           <w:bCs/>
         </w:rPr>
-        <w:t xml:space="preserve">Assumptions &amp; data sources: </w:t>
-      </w:r>
-      <w:r>
-        <w:t xml:space="preserve">Based on published agronomic studies of comparable sensor-guided irrigation systems elsewhere — not yet based on FieldSense's own metered data.</w:t>
+        <w:t xml:space="preserve">Baseline: </w:t>
+      </w:r>
+      <w:r>
+        <w:t xml:space="preserve">Regional average water withdrawal per irrigated hectare (published statistics)</w:t>
+      </w:r>
+    </w:p>
+    <w:p>
+      <w:r>
+        <w:rPr>
+          <w:b/>
+          <w:bCs/>
+        </w:rPr>
+        <w:t xml:space="preserve">Evidence and data sources: </w:t>
+      </w:r>
+      <w:r>
+        <w:t xml:space="preserve">Published agronomic studies of comparable sensor-guided irrigation systems in other regions</w:t>
+      </w:r>
+    </w:p>
+    <w:p>
+      <w:r>
+        <w:rPr>
+          <w:b/>
+          <w:bCs/>
+        </w:rPr>
+        <w:t xml:space="preserve">Relies on pathway step: </w:t>
+      </w:r>
+      <w:r>
+        <w:t xml:space="preserve">Adoption chain → Impact: avoided environmental harm. Assumption: Water savings are not offset by farmers expanding their irrigated area with the water they save (rebound effect). (evidence: Not rated)</w:t>
+      </w:r>
+    </w:p>
+    <w:p>
+      <w:r>
+        <w:rPr>
+          <w:b/>
+          <w:bCs/>
+        </w:rPr>
+        <w:t xml:space="preserve">Assumptions: </w:t>
+      </w:r>
+      <w:r>
+        <w:t xml:space="preserve">Not yet based on FieldSense's own metered data; assumes pilot farms behave like the farms in the published studies.</w:t>
       </w:r>
     </w:p>
     <w:p>
@@ -1849,6 +2738,21 @@
           <w:color w:val="2E6B4F"/>
         </w:rPr>
         <w:t xml:space="preserve">✓  All core indicators are linked to an impact-pathway stage.</w:t>
+      </w:r>
+    </w:p>
+    <w:p>
+      <w:pPr>
+        <w:pStyle w:val="ListParagraph"/>
+        <w:numPr>
+          <w:ilvl w:val="0"/>
+          <w:numId w:val="1"/>
+        </w:numPr>
+      </w:pPr>
+      <w:r>
+        <w:rPr>
+          <w:color w:val="2E6B4F"/>
+        </w:rPr>
+        <w:t xml:space="preserve">✓  No claim–evidence gaps: wording, baselines and sources match the evidence labels.</w:t>
       </w:r>
     </w:p>
     <w:p>

</xml_diff>

<commit_message>
Module 5: structured recommendations and impact-business alignment
Recommendations now state the evidence gap, its implication, the action
and why it matters at the current development stage, prioritised by stage.

New impact-business alignment analysis: customer value next to
environmental value, whether the customer's reason to buy is tied to the
environmental benefit, and the commercial assumptions the benefit depends
on, each with a check and a team-set status. Explicitly not a viability
score. Unvalidated assumptions feed the recommendations.

Report gains section 6 (alignment); recommendations become section 7 and
the review plan section 8.

Co-Authored-By: Claude Opus 5.5 <noreply@anthropic.com>
Claude-Session: https://claude.ai/code/session_01NsReyfcWBUffzS8XqtSvgs
</commit_message>
<xml_diff>
--- a/sample_reports/FieldSense_impact_report.docx
+++ b/sample_reports/FieldSense_impact_report.docx
@@ -174,7 +174,19 @@
         </w:numPr>
       </w:pPr>
       <w:r>
-        <w:t xml:space="preserve">Next steps: 3 recommended — see Section 6</w:t>
+        <w:t xml:space="preserve">Recommendations: 6 — see Section 7</w:t>
+      </w:r>
+    </w:p>
+    <w:p>
+      <w:pPr>
+        <w:pStyle w:val="ListParagraph"/>
+        <w:numPr>
+          <w:ilvl w:val="0"/>
+          <w:numId w:val="1"/>
+        </w:numPr>
+      </w:pPr>
+      <w:r>
+        <w:t xml:space="preserve">Impact–business alignment: Aligned; 6 of 6 critical assumptions not yet validated — see Section 6</w:t>
       </w:r>
     </w:p>
     <w:p>
@@ -2760,71 +2772,7 @@
         <w:pStyle w:val="Heading1"/>
       </w:pPr>
       <w:r>
-        <w:t xml:space="preserve">6. Next Steps &amp; Points to Consider</w:t>
-      </w:r>
-    </w:p>
-    <w:p>
-      <w:pPr>
-        <w:pStyle w:val="Heading2"/>
-      </w:pPr>
-      <w:r>
-        <w:t xml:space="preserve">Recommended next steps</w:t>
-      </w:r>
-    </w:p>
-    <w:p>
-      <w:pPr>
-        <w:ind w:left="360" w:hanging="360"/>
-      </w:pPr>
-      <w:r>
-        <w:rPr>
-          <w:b/>
-          <w:bCs/>
-          <w:color w:val="2E6B4F"/>
-        </w:rPr>
-        <w:t xml:space="preserve">1.  Test the weakest link. </w:t>
-      </w:r>
-      <w:r>
-        <w:t xml:space="preserve">“Outcomes: customer behavior change” currently rests on an assumption only (“App engagement actually translates into reduced water applied, not just reduced perceived need to water.”). Design one small, cheap test that would confirm or refute it before you build further claims on it. For an adoption-driven pathway, compare usage logs or meter readings for a few pilot customers before and after they adopt.</w:t>
-      </w:r>
-    </w:p>
-    <w:p>
-      <w:pPr>
-        <w:ind w:left="360" w:hanging="360"/>
-      </w:pPr>
-      <w:r>
-        <w:rPr>
-          <w:b/>
-          <w:bCs/>
-          <w:color w:val="2E6B4F"/>
-        </w:rPr>
-        <w:t xml:space="preserve">2.  Test the weakest link. </w:t>
-      </w:r>
-      <w:r>
-        <w:t xml:space="preserve">“Activities: product features / service delivered” currently rests on an assumption only (“Recommendations are accurate and trustworthy enough that farmers follow them instead of habitual watering schedules.”). Design one small, cheap test that would confirm or refute it before you build further claims on it.</w:t>
-      </w:r>
-    </w:p>
-    <w:p>
-      <w:pPr>
-        <w:ind w:left="360" w:hanging="360"/>
-      </w:pPr>
-      <w:r>
-        <w:rPr>
-          <w:b/>
-          <w:bCs/>
-          <w:color w:val="2E6B4F"/>
-        </w:rPr>
-        <w:t xml:space="preserve">3.  Plan your future indicators. </w:t>
-      </w:r>
-      <w:r>
-        <w:t xml:space="preserve">“Avoided physical harm per unit of adoption (domain-specific)” is relevant but not yet measurable. Note what would make it measurable (a tool, a partner, budget, a pilot customer sharing data) and at which milestone you expect it.</w:t>
-      </w:r>
-    </w:p>
-    <w:p>
-      <w:pPr>
-        <w:pStyle w:val="Heading2"/>
-      </w:pPr>
-      <w:r>
-        <w:t xml:space="preserve">Points to consider</w:t>
+        <w:t xml:space="preserve">6. Impact–Business Alignment</w:t>
       </w:r>
     </w:p>
     <w:p>
@@ -2836,6 +2784,1014 @@
           <w:sz w:val="19"/>
           <w:szCs w:val="19"/>
         </w:rPr>
+        <w:t xml:space="preserve">Where the environmental benefit depends on commercial assumptions. Not a commercial viability score and not business due diligence: commercial questions appear only where they decide whether the environmental benefit happens or can be evidenced.</w:t>
+      </w:r>
+    </w:p>
+    <w:tbl>
+      <w:tblPr>
+        <w:tblW w:type="dxa" w:w="9000"/>
+        <w:tblBorders>
+          <w:top w:val="single" w:color="auto" w:sz="4"/>
+          <w:left w:val="single" w:color="auto" w:sz="4"/>
+          <w:bottom w:val="single" w:color="auto" w:sz="4"/>
+          <w:right w:val="single" w:color="auto" w:sz="4"/>
+          <w:insideH w:val="single" w:color="auto" w:sz="4"/>
+          <w:insideV w:val="single" w:color="auto" w:sz="4"/>
+        </w:tblBorders>
+        <w:tblLayout w:type="fixed"/>
+      </w:tblPr>
+      <w:tblGrid>
+        <w:gridCol w:w="4500"/>
+        <w:gridCol w:w="4500"/>
+      </w:tblGrid>
+      <w:tr>
+        <w:trPr>
+          <w:tblHeader/>
+        </w:trPr>
+        <w:tc>
+          <w:tcPr>
+            <w:tcW w:type="dxa" w:w="4500"/>
+            <w:tcBorders>
+              <w:top w:val="single" w:color="C9D8CE" w:sz="4"/>
+              <w:left w:val="single" w:color="C9D8CE" w:sz="4"/>
+              <w:bottom w:val="single" w:color="C9D8CE" w:sz="4"/>
+              <w:right w:val="single" w:color="C9D8CE" w:sz="4"/>
+            </w:tcBorders>
+            <w:shd w:fill="2E6B4F" w:color="auto" w:val="clear"/>
+            <w:tcMar>
+              <w:top w:type="dxa" w:w="60"/>
+              <w:left w:type="dxa" w:w="90"/>
+              <w:bottom w:type="dxa" w:w="60"/>
+              <w:right w:type="dxa" w:w="90"/>
+            </w:tcMar>
+          </w:tcPr>
+          <w:p>
+            <w:r>
+              <w:rPr>
+                <w:b/>
+                <w:bCs/>
+                <w:color w:val="FFFFFF"/>
+                <w:sz w:val="19"/>
+                <w:szCs w:val="19"/>
+              </w:rPr>
+              <w:t xml:space="preserve">Customer value</w:t>
+            </w:r>
+          </w:p>
+        </w:tc>
+        <w:tc>
+          <w:tcPr>
+            <w:tcW w:type="dxa" w:w="4500"/>
+            <w:tcBorders>
+              <w:top w:val="single" w:color="C9D8CE" w:sz="4"/>
+              <w:left w:val="single" w:color="C9D8CE" w:sz="4"/>
+              <w:bottom w:val="single" w:color="C9D8CE" w:sz="4"/>
+              <w:right w:val="single" w:color="C9D8CE" w:sz="4"/>
+            </w:tcBorders>
+            <w:shd w:fill="2E6B4F" w:color="auto" w:val="clear"/>
+            <w:tcMar>
+              <w:top w:type="dxa" w:w="60"/>
+              <w:left w:type="dxa" w:w="90"/>
+              <w:bottom w:type="dxa" w:w="60"/>
+              <w:right w:type="dxa" w:w="90"/>
+            </w:tcMar>
+          </w:tcPr>
+          <w:p>
+            <w:r>
+              <w:rPr>
+                <w:b/>
+                <w:bCs/>
+                <w:color w:val="FFFFFF"/>
+                <w:sz w:val="19"/>
+                <w:szCs w:val="19"/>
+              </w:rPr>
+              <w:t xml:space="preserve">Environmental value</w:t>
+            </w:r>
+          </w:p>
+        </w:tc>
+      </w:tr>
+      <w:tr>
+        <w:tc>
+          <w:tcPr>
+            <w:tcW w:type="dxa" w:w="4500"/>
+            <w:tcBorders>
+              <w:top w:val="single" w:color="C9D8CE" w:sz="4"/>
+              <w:left w:val="single" w:color="C9D8CE" w:sz="4"/>
+              <w:bottom w:val="single" w:color="C9D8CE" w:sz="4"/>
+              <w:right w:val="single" w:color="C9D8CE" w:sz="4"/>
+            </w:tcBorders>
+            <w:tcMar>
+              <w:top w:type="dxa" w:w="60"/>
+              <w:left w:type="dxa" w:w="90"/>
+              <w:bottom w:type="dxa" w:w="60"/>
+              <w:right w:type="dxa" w:w="90"/>
+            </w:tcMar>
+          </w:tcPr>
+          <w:p>
+            <w:r>
+              <w:rPr>
+                <w:b w:val="false"/>
+                <w:bCs w:val="false"/>
+                <w:sz w:val="19"/>
+                <w:szCs w:val="19"/>
+              </w:rPr>
+              <w:t xml:space="preserve">Lower water and pumping costs with stable yields: every m³ of water the farm does not apply is also money saved.</w:t>
+            </w:r>
+          </w:p>
+        </w:tc>
+        <w:tc>
+          <w:tcPr>
+            <w:tcW w:type="dxa" w:w="4500"/>
+            <w:tcBorders>
+              <w:top w:val="single" w:color="C9D8CE" w:sz="4"/>
+              <w:left w:val="single" w:color="C9D8CE" w:sz="4"/>
+              <w:bottom w:val="single" w:color="C9D8CE" w:sz="4"/>
+              <w:right w:val="single" w:color="C9D8CE" w:sz="4"/>
+            </w:tcBorders>
+            <w:tcMar>
+              <w:top w:type="dxa" w:w="60"/>
+              <w:left w:type="dxa" w:w="90"/>
+              <w:bottom w:type="dxa" w:w="60"/>
+              <w:right w:type="dxa" w:w="90"/>
+            </w:tcMar>
+          </w:tcPr>
+          <w:p>
+            <w:r>
+              <w:rPr>
+                <w:b w:val="false"/>
+                <w:bCs w:val="false"/>
+                <w:sz w:val="19"/>
+                <w:szCs w:val="19"/>
+              </w:rPr>
+              <w:t xml:space="preserve">Reduced groundwater and surface-water withdrawal per irrigated hectare.</w:t>
+            </w:r>
+          </w:p>
+        </w:tc>
+      </w:tr>
+    </w:tbl>
+    <w:p>
+      <w:pPr>
+        <w:spacing w:before="160"/>
+      </w:pPr>
+      <w:r>
+        <w:rPr>
+          <w:b/>
+          <w:bCs/>
+        </w:rPr>
+        <w:t xml:space="preserve">Alignment: Aligned. </w:t>
+      </w:r>
+      <w:r>
+        <w:t xml:space="preserve">The customer's reason to buy comes from the same change that produces the environmental benefit (it saves them money). Commercial success and impact should move together, as long as the assumptions below hold.</w:t>
+      </w:r>
+    </w:p>
+    <w:p>
+      <w:pPr>
+        <w:pStyle w:val="Heading2"/>
+      </w:pPr>
+      <w:r>
+        <w:t xml:space="preserve">Critical assumptions</w:t>
+      </w:r>
+    </w:p>
+    <w:p>
+      <w:pPr>
+        <w:spacing w:before="120"/>
+      </w:pPr>
+      <w:r>
+        <w:rPr>
+          <w:b/>
+          <w:bCs/>
+          <w:color w:val="D9661F"/>
+        </w:rPr>
+        <w:t xml:space="preserve">!  </w:t>
+      </w:r>
+      <w:r>
+        <w:rPr>
+          <w:b/>
+          <w:bCs/>
+        </w:rPr>
+        <w:t xml:space="preserve">Customers find the product worth paying for (device or equipment plus a subscription).</w:t>
+      </w:r>
+      <w:r>
+        <w:rPr>
+          <w:b/>
+          <w:bCs/>
+          <w:color w:val="D9661F"/>
+          <w:sz w:val="18"/>
+          <w:szCs w:val="18"/>
+        </w:rPr>
+        <w:t xml:space="preserve">  [NOT CHECKED YET]</w:t>
+      </w:r>
+    </w:p>
+    <w:p>
+      <w:pPr>
+        <w:ind w:left="360"/>
+      </w:pPr>
+      <w:r>
+        <w:rPr>
+          <w:b/>
+          <w:bCs/>
+        </w:rPr>
+        <w:t xml:space="preserve">Why it matters: </w:t>
+      </w:r>
+      <w:r>
+        <w:t xml:space="preserve">If customers do not buy it, the adoption step never happens and none of the environmental benefit follows.</w:t>
+      </w:r>
+    </w:p>
+    <w:p>
+      <w:pPr>
+        <w:ind w:left="360"/>
+      </w:pPr>
+      <w:r>
+        <w:rPr>
+          <w:b/>
+          <w:bCs/>
+        </w:rPr>
+        <w:t xml:space="preserve">How to check: </w:t>
+      </w:r>
+      <w:r>
+        <w:t xml:space="preserve">Interview pilot customers about what the problem costs them today and what they would pay. A paid pilot or a letter of intent is stronger evidence than stated interest.</w:t>
+      </w:r>
+    </w:p>
+    <w:p>
+      <w:pPr>
+        <w:spacing w:before="120"/>
+      </w:pPr>
+      <w:r>
+        <w:rPr>
+          <w:b/>
+          <w:bCs/>
+          <w:color w:val="D9661F"/>
+        </w:rPr>
+        <w:t xml:space="preserve">!  </w:t>
+      </w:r>
+      <w:r>
+        <w:rPr>
+          <w:b/>
+          <w:bCs/>
+        </w:rPr>
+        <w:t xml:space="preserve">Using the product leads to an actual change in what customers or users do.</w:t>
+      </w:r>
+      <w:r>
+        <w:rPr>
+          <w:b/>
+          <w:bCs/>
+          <w:color w:val="D9661F"/>
+          <w:sz w:val="18"/>
+          <w:szCs w:val="18"/>
+        </w:rPr>
+        <w:t xml:space="preserve">  [NOT CHECKED YET]</w:t>
+      </w:r>
+    </w:p>
+    <w:p>
+      <w:pPr>
+        <w:ind w:left="360"/>
+      </w:pPr>
+      <w:r>
+        <w:rPr>
+          <w:b/>
+          <w:bCs/>
+        </w:rPr>
+        <w:t xml:space="preserve">Why it matters: </w:t>
+      </w:r>
+      <w:r>
+        <w:t xml:space="preserve">Customers can pay and still carry on as before; the environmental benefit needs the change, not the sale.</w:t>
+      </w:r>
+    </w:p>
+    <w:p>
+      <w:pPr>
+        <w:ind w:left="360"/>
+      </w:pPr>
+      <w:r>
+        <w:rPr>
+          <w:b/>
+          <w:bCs/>
+        </w:rPr>
+        <w:t xml:space="preserve">How to check: </w:t>
+      </w:r>
+      <w:r>
+        <w:t xml:space="preserve">Track whether recommendations or features translate into behaviour change: usage logs combined with the data from the behaviour step.</w:t>
+      </w:r>
+    </w:p>
+    <w:p>
+      <w:pPr>
+        <w:spacing w:before="120"/>
+      </w:pPr>
+      <w:r>
+        <w:rPr>
+          <w:b/>
+          <w:bCs/>
+          <w:color w:val="D9661F"/>
+        </w:rPr>
+        <w:t xml:space="preserve">!  </w:t>
+      </w:r>
+      <w:r>
+        <w:rPr>
+          <w:b/>
+          <w:bCs/>
+        </w:rPr>
+        <w:t xml:space="preserve">The change that saves the customer money is the same change that produces the environmental benefit, and it yields measurable net savings.</w:t>
+      </w:r>
+      <w:r>
+        <w:rPr>
+          <w:b/>
+          <w:bCs/>
+          <w:color w:val="D9661F"/>
+          <w:sz w:val="18"/>
+          <w:szCs w:val="18"/>
+        </w:rPr>
+        <w:t xml:space="preserve">  [NOT CHECKED YET]</w:t>
+      </w:r>
+    </w:p>
+    <w:p>
+      <w:pPr>
+        <w:ind w:left="360"/>
+      </w:pPr>
+      <w:r>
+        <w:rPr>
+          <w:b/>
+          <w:bCs/>
+        </w:rPr>
+        <w:t xml:space="preserve">Why it matters: </w:t>
+      </w:r>
+      <w:r>
+        <w:t xml:space="preserve">If customers save money in another way (e.g. labour or time), the business can succeed while the environmental benefit stays small.</w:t>
+      </w:r>
+    </w:p>
+    <w:p>
+      <w:pPr>
+        <w:ind w:left="360"/>
+      </w:pPr>
+      <w:r>
+        <w:rPr>
+          <w:b/>
+          <w:bCs/>
+        </w:rPr>
+        <w:t xml:space="preserve">How to check: </w:t>
+      </w:r>
+      <w:r>
+        <w:t xml:space="preserve">Compare pilot usage against a clearly defined baseline, tracking the customer's saving and the environmental saving from the same data.</w:t>
+      </w:r>
+    </w:p>
+    <w:p>
+      <w:pPr>
+        <w:spacing w:before="120"/>
+      </w:pPr>
+      <w:r>
+        <w:rPr>
+          <w:b/>
+          <w:bCs/>
+          <w:color w:val="D9661F"/>
+        </w:rPr>
+        <w:t xml:space="preserve">!  </w:t>
+      </w:r>
+      <w:r>
+        <w:rPr>
+          <w:b/>
+          <w:bCs/>
+        </w:rPr>
+        <w:t xml:space="preserve">Lower costs do not lead customers to expand their use (e.g. irrigate more land with the water they save).</w:t>
+      </w:r>
+      <w:r>
+        <w:rPr>
+          <w:b/>
+          <w:bCs/>
+          <w:color w:val="D9661F"/>
+          <w:sz w:val="18"/>
+          <w:szCs w:val="18"/>
+        </w:rPr>
+        <w:t xml:space="preserve">  [NOT CHECKED YET]</w:t>
+      </w:r>
+    </w:p>
+    <w:p>
+      <w:pPr>
+        <w:ind w:left="360"/>
+      </w:pPr>
+      <w:r>
+        <w:rPr>
+          <w:b/>
+          <w:bCs/>
+        </w:rPr>
+        <w:t xml:space="preserve">Why it matters: </w:t>
+      </w:r>
+      <w:r>
+        <w:t xml:space="preserve">Commercial success can then erode the net environmental benefit: the better the product sells, the more the rebound matters.</w:t>
+      </w:r>
+    </w:p>
+    <w:p>
+      <w:pPr>
+        <w:ind w:left="360"/>
+      </w:pPr>
+      <w:r>
+        <w:rPr>
+          <w:b/>
+          <w:bCs/>
+        </w:rPr>
+        <w:t xml:space="preserve">How to check: </w:t>
+      </w:r>
+      <w:r>
+        <w:t xml:space="preserve">Ask pilot customers what they do with the savings, and track the total, not only the per-unit, resource use.</w:t>
+      </w:r>
+    </w:p>
+    <w:p>
+      <w:pPr>
+        <w:spacing w:before="120"/>
+      </w:pPr>
+      <w:r>
+        <w:rPr>
+          <w:b/>
+          <w:bCs/>
+          <w:color w:val="D9661F"/>
+        </w:rPr>
+        <w:t xml:space="preserve">!  </w:t>
+      </w:r>
+      <w:r>
+        <w:rPr>
+          <w:b/>
+          <w:bCs/>
+        </w:rPr>
+        <w:t xml:space="preserve">Customers keep paying and using the product beyond the first season or year.</w:t>
+      </w:r>
+      <w:r>
+        <w:rPr>
+          <w:b/>
+          <w:bCs/>
+          <w:color w:val="D9661F"/>
+          <w:sz w:val="18"/>
+          <w:szCs w:val="18"/>
+        </w:rPr>
+        <w:t xml:space="preserve">  [NOT CHECKED YET]</w:t>
+      </w:r>
+    </w:p>
+    <w:p>
+      <w:pPr>
+        <w:ind w:left="360"/>
+      </w:pPr>
+      <w:r>
+        <w:rPr>
+          <w:b/>
+          <w:bCs/>
+        </w:rPr>
+        <w:t xml:space="preserve">Why it matters: </w:t>
+      </w:r>
+      <w:r>
+        <w:t xml:space="preserve">With a subscription, the impact stops when a customer cancels, so churn directly reduces the environmental benefit.</w:t>
+      </w:r>
+    </w:p>
+    <w:p>
+      <w:pPr>
+        <w:ind w:left="360"/>
+      </w:pPr>
+      <w:r>
+        <w:rPr>
+          <w:b/>
+          <w:bCs/>
+        </w:rPr>
+        <w:t xml:space="preserve">How to check: </w:t>
+      </w:r>
+      <w:r>
+        <w:t xml:space="preserve">Track retention of active customers per period and report impact only for customers who stay.</w:t>
+      </w:r>
+    </w:p>
+    <w:p>
+      <w:pPr>
+        <w:spacing w:before="120"/>
+      </w:pPr>
+      <w:r>
+        <w:rPr>
+          <w:b/>
+          <w:bCs/>
+          <w:color w:val="D9661F"/>
+        </w:rPr>
+        <w:t xml:space="preserve">!  </w:t>
+      </w:r>
+      <w:r>
+        <w:rPr>
+          <w:b/>
+          <w:bCs/>
+        </w:rPr>
+        <w:t xml:space="preserve">Adoption grows to the level that your projected impact figures assume.</w:t>
+      </w:r>
+      <w:r>
+        <w:rPr>
+          <w:b/>
+          <w:bCs/>
+          <w:color w:val="D9661F"/>
+          <w:sz w:val="18"/>
+          <w:szCs w:val="18"/>
+        </w:rPr>
+        <w:t xml:space="preserve">  [NOT CHECKED YET]</w:t>
+      </w:r>
+    </w:p>
+    <w:p>
+      <w:pPr>
+        <w:ind w:left="360"/>
+      </w:pPr>
+      <w:r>
+        <w:rPr>
+          <w:b/>
+          <w:bCs/>
+        </w:rPr>
+        <w:t xml:space="preserve">Why it matters: </w:t>
+      </w:r>
+      <w:r>
+        <w:t xml:space="preserve">A projected environmental figure is only as good as the sales forecast behind it.</w:t>
+      </w:r>
+    </w:p>
+    <w:p>
+      <w:pPr>
+        <w:ind w:left="360"/>
+      </w:pPr>
+      <w:r>
+        <w:rPr>
+          <w:b/>
+          <w:bCs/>
+        </w:rPr>
+        <w:t xml:space="preserve">How to check: </w:t>
+      </w:r>
+      <w:r>
+        <w:t xml:space="preserve">State the number of customers or hectares each projection assumes, and compare it with your actual sales pipeline.</w:t>
+      </w:r>
+    </w:p>
+    <w:p>
+      <w:pPr>
+        <w:pStyle w:val="Heading1"/>
+      </w:pPr>
+      <w:r>
+        <w:t xml:space="preserve">7. Recommendations &amp; Points to Consider</w:t>
+      </w:r>
+    </w:p>
+    <w:p>
+      <w:pPr>
+        <w:pStyle w:val="Heading3"/>
+      </w:pPr>
+      <w:r>
+        <w:t xml:space="preserve">1. Test the weakest link</w:t>
+      </w:r>
+      <w:r>
+        <w:rPr>
+          <w:b/>
+          <w:bCs/>
+          <w:color w:val="AA3333"/>
+        </w:rPr>
+        <w:t xml:space="preserve">  [HIGH PRIORITY]</w:t>
+      </w:r>
+    </w:p>
+    <w:p>
+      <w:pPr>
+        <w:ind w:left="360"/>
+      </w:pPr>
+      <w:r>
+        <w:rPr>
+          <w:b/>
+          <w:bCs/>
+        </w:rPr>
+        <w:t xml:space="preserve">Evidence gap: </w:t>
+      </w:r>
+      <w:r>
+        <w:t xml:space="preserve">“Outcomes: customer behavior change” rests on an assumption only: “App engagement actually translates into reduced water applied, not just reduced perceived need to water.”</w:t>
+      </w:r>
+    </w:p>
+    <w:p>
+      <w:pPr>
+        <w:ind w:left="360"/>
+      </w:pPr>
+      <w:r>
+        <w:rPr>
+          <w:b/>
+          <w:bCs/>
+        </w:rPr>
+        <w:t xml:space="preserve">What it means: </w:t>
+      </w:r>
+      <w:r>
+        <w:t xml:space="preserve">Every claim further down the chain inherits this uncertainty. If the assumption fails, the environmental benefit does not happen, however well the technology works.</w:t>
+      </w:r>
+    </w:p>
+    <w:p>
+      <w:pPr>
+        <w:ind w:left="360"/>
+      </w:pPr>
+      <w:r>
+        <w:rPr>
+          <w:b/>
+          <w:bCs/>
+        </w:rPr>
+        <w:t xml:space="preserve">Recommended action: </w:t>
+      </w:r>
+      <w:r>
+        <w:t xml:space="preserve">Design one small, cheap test that would confirm or refute it before you build further claims on it. For an adoption-driven pathway, compare usage logs or meter readings for a few pilot customers before and after they adopt.</w:t>
+      </w:r>
+    </w:p>
+    <w:p>
+      <w:pPr>
+        <w:ind w:left="360"/>
+      </w:pPr>
+      <w:r>
+        <w:rPr>
+          <w:b/>
+          <w:bCs/>
+        </w:rPr>
+        <w:t xml:space="preserve">Why now (Validation / MVP): </w:t>
+      </w:r>
+      <w:r>
+        <w:t xml:space="preserve">At validation the open question is whether real customers adopt the product and use it as intended. That makes this a priority now.</w:t>
+      </w:r>
+    </w:p>
+    <w:p>
+      <w:pPr>
+        <w:pStyle w:val="Heading3"/>
+      </w:pPr>
+      <w:r>
+        <w:t xml:space="preserve">2. Test the weakest link</w:t>
+      </w:r>
+      <w:r>
+        <w:rPr>
+          <w:b/>
+          <w:bCs/>
+          <w:color w:val="AA3333"/>
+        </w:rPr>
+        <w:t xml:space="preserve">  [HIGH PRIORITY]</w:t>
+      </w:r>
+    </w:p>
+    <w:p>
+      <w:pPr>
+        <w:ind w:left="360"/>
+      </w:pPr>
+      <w:r>
+        <w:rPr>
+          <w:b/>
+          <w:bCs/>
+        </w:rPr>
+        <w:t xml:space="preserve">Evidence gap: </w:t>
+      </w:r>
+      <w:r>
+        <w:t xml:space="preserve">“Activities: product features / service delivered” rests on an assumption only: “Recommendations are accurate and trustworthy enough that farmers follow them instead of habitual watering schedules.”</w:t>
+      </w:r>
+    </w:p>
+    <w:p>
+      <w:pPr>
+        <w:ind w:left="360"/>
+      </w:pPr>
+      <w:r>
+        <w:rPr>
+          <w:b/>
+          <w:bCs/>
+        </w:rPr>
+        <w:t xml:space="preserve">What it means: </w:t>
+      </w:r>
+      <w:r>
+        <w:t xml:space="preserve">Every claim further down the chain inherits this uncertainty. If the assumption fails, the environmental benefit does not happen, however well the technology works.</w:t>
+      </w:r>
+    </w:p>
+    <w:p>
+      <w:pPr>
+        <w:ind w:left="360"/>
+      </w:pPr>
+      <w:r>
+        <w:rPr>
+          <w:b/>
+          <w:bCs/>
+        </w:rPr>
+        <w:t xml:space="preserve">Recommended action: </w:t>
+      </w:r>
+      <w:r>
+        <w:t xml:space="preserve">Design one small, cheap test that would confirm or refute it before you build further claims on it.</w:t>
+      </w:r>
+    </w:p>
+    <w:p>
+      <w:pPr>
+        <w:ind w:left="360"/>
+      </w:pPr>
+      <w:r>
+        <w:rPr>
+          <w:b/>
+          <w:bCs/>
+        </w:rPr>
+        <w:t xml:space="preserve">Why now (Validation / MVP): </w:t>
+      </w:r>
+      <w:r>
+        <w:t xml:space="preserve">At validation the open question is whether real customers adopt the product and use it as intended. That makes this a priority now.</w:t>
+      </w:r>
+    </w:p>
+    <w:p>
+      <w:pPr>
+        <w:pStyle w:val="Heading3"/>
+      </w:pPr>
+      <w:r>
+        <w:t xml:space="preserve">3. Check that customers find it worth paying for</w:t>
+      </w:r>
+      <w:r>
+        <w:rPr>
+          <w:b/>
+          <w:bCs/>
+          <w:color w:val="AA3333"/>
+        </w:rPr>
+        <w:t xml:space="preserve">  [HIGH PRIORITY]</w:t>
+      </w:r>
+    </w:p>
+    <w:p>
+      <w:pPr>
+        <w:ind w:left="360"/>
+      </w:pPr>
+      <w:r>
+        <w:rPr>
+          <w:b/>
+          <w:bCs/>
+        </w:rPr>
+        <w:t xml:space="preserve">Evidence gap: </w:t>
+      </w:r>
+      <w:r>
+        <w:t xml:space="preserve">Assumption not yet checked: customers find the product worth paying for (device or equipment plus a subscription).</w:t>
+      </w:r>
+    </w:p>
+    <w:p>
+      <w:pPr>
+        <w:ind w:left="360"/>
+      </w:pPr>
+      <w:r>
+        <w:rPr>
+          <w:b/>
+          <w:bCs/>
+        </w:rPr>
+        <w:t xml:space="preserve">What it means: </w:t>
+      </w:r>
+      <w:r>
+        <w:t xml:space="preserve">If customers do not buy it, the adoption step never happens and none of the environmental benefit follows.</w:t>
+      </w:r>
+    </w:p>
+    <w:p>
+      <w:pPr>
+        <w:ind w:left="360"/>
+      </w:pPr>
+      <w:r>
+        <w:rPr>
+          <w:b/>
+          <w:bCs/>
+        </w:rPr>
+        <w:t xml:space="preserve">Recommended action: </w:t>
+      </w:r>
+      <w:r>
+        <w:t xml:space="preserve">Interview pilot customers about what the problem costs them today and what they would pay. A paid pilot or a letter of intent is stronger evidence than stated interest.</w:t>
+      </w:r>
+    </w:p>
+    <w:p>
+      <w:pPr>
+        <w:ind w:left="360"/>
+      </w:pPr>
+      <w:r>
+        <w:rPr>
+          <w:b/>
+          <w:bCs/>
+        </w:rPr>
+        <w:t xml:space="preserve">Why now (Validation / MVP): </w:t>
+      </w:r>
+      <w:r>
+        <w:t xml:space="preserve">At validation the open question is whether real customers adopt the product and use it as intended. That makes this a priority now.</w:t>
+      </w:r>
+    </w:p>
+    <w:p>
+      <w:pPr>
+        <w:pStyle w:val="Heading3"/>
+      </w:pPr>
+      <w:r>
+        <w:t xml:space="preserve">4. Check that the saving and the impact come from the same change</w:t>
+      </w:r>
+      <w:r>
+        <w:rPr>
+          <w:b/>
+          <w:bCs/>
+          <w:color w:val="AA3333"/>
+        </w:rPr>
+        <w:t xml:space="preserve">  [HIGH PRIORITY]</w:t>
+      </w:r>
+    </w:p>
+    <w:p>
+      <w:pPr>
+        <w:ind w:left="360"/>
+      </w:pPr>
+      <w:r>
+        <w:rPr>
+          <w:b/>
+          <w:bCs/>
+        </w:rPr>
+        <w:t xml:space="preserve">Evidence gap: </w:t>
+      </w:r>
+      <w:r>
+        <w:t xml:space="preserve">Assumption not yet checked: the change that saves the customer money is the same change that produces the environmental benefit, and it yields measurable net savings.</w:t>
+      </w:r>
+    </w:p>
+    <w:p>
+      <w:pPr>
+        <w:ind w:left="360"/>
+      </w:pPr>
+      <w:r>
+        <w:rPr>
+          <w:b/>
+          <w:bCs/>
+        </w:rPr>
+        <w:t xml:space="preserve">What it means: </w:t>
+      </w:r>
+      <w:r>
+        <w:t xml:space="preserve">If customers save money in another way (e.g. labour or time), the business can succeed while the environmental benefit stays small.</w:t>
+      </w:r>
+    </w:p>
+    <w:p>
+      <w:pPr>
+        <w:ind w:left="360"/>
+      </w:pPr>
+      <w:r>
+        <w:rPr>
+          <w:b/>
+          <w:bCs/>
+        </w:rPr>
+        <w:t xml:space="preserve">Recommended action: </w:t>
+      </w:r>
+      <w:r>
+        <w:t xml:space="preserve">Compare pilot usage against a clearly defined baseline, tracking the customer's saving and the environmental saving from the same data.</w:t>
+      </w:r>
+    </w:p>
+    <w:p>
+      <w:pPr>
+        <w:ind w:left="360"/>
+      </w:pPr>
+      <w:r>
+        <w:rPr>
+          <w:b/>
+          <w:bCs/>
+        </w:rPr>
+        <w:t xml:space="preserve">Why now (Validation / MVP): </w:t>
+      </w:r>
+      <w:r>
+        <w:t xml:space="preserve">At validation the open question is whether real customers adopt the product and use it as intended. That makes this a priority now.</w:t>
+      </w:r>
+    </w:p>
+    <w:p>
+      <w:pPr>
+        <w:pStyle w:val="Heading3"/>
+      </w:pPr>
+      <w:r>
+        <w:t xml:space="preserve">5. Plan your future indicators</w:t>
+      </w:r>
+      <w:r>
+        <w:rPr>
+          <w:b/>
+          <w:bCs/>
+          <w:color w:val="B8860B"/>
+        </w:rPr>
+        <w:t xml:space="preserve">  [MEDIUM PRIORITY]</w:t>
+      </w:r>
+    </w:p>
+    <w:p>
+      <w:pPr>
+        <w:ind w:left="360"/>
+      </w:pPr>
+      <w:r>
+        <w:rPr>
+          <w:b/>
+          <w:bCs/>
+        </w:rPr>
+        <w:t xml:space="preserve">Evidence gap: </w:t>
+      </w:r>
+      <w:r>
+        <w:t xml:space="preserve">“Avoided physical harm per unit of adoption (domain-specific)” is relevant but not yet measurable.</w:t>
+      </w:r>
+    </w:p>
+    <w:p>
+      <w:pPr>
+        <w:ind w:left="360"/>
+      </w:pPr>
+      <w:r>
+        <w:rPr>
+          <w:b/>
+          <w:bCs/>
+        </w:rPr>
+        <w:t xml:space="preserve">What it means: </w:t>
+      </w:r>
+      <w:r>
+        <w:t xml:space="preserve">Until it is measured, the most relevant part of your impact stays a projection.</w:t>
+      </w:r>
+    </w:p>
+    <w:p>
+      <w:pPr>
+        <w:ind w:left="360"/>
+      </w:pPr>
+      <w:r>
+        <w:rPr>
+          <w:b/>
+          <w:bCs/>
+        </w:rPr>
+        <w:t xml:space="preserve">Recommended action: </w:t>
+      </w:r>
+      <w:r>
+        <w:t xml:space="preserve">Note what would make it measurable (a tool, a partner, budget, a pilot customer sharing data) and at which milestone you expect it.</w:t>
+      </w:r>
+    </w:p>
+    <w:p>
+      <w:pPr>
+        <w:ind w:left="360"/>
+      </w:pPr>
+      <w:r>
+        <w:rPr>
+          <w:b/>
+          <w:bCs/>
+        </w:rPr>
+        <w:t xml:space="preserve">Why now (Validation / MVP): </w:t>
+      </w:r>
+      <w:r>
+        <w:t xml:space="preserve">At validation the open question is whether real customers adopt the product and use it as intended. Worth doing now, after the high-priority items.</w:t>
+      </w:r>
+    </w:p>
+    <w:p>
+      <w:pPr>
+        <w:pStyle w:val="Heading3"/>
+      </w:pPr>
+      <w:r>
+        <w:t xml:space="preserve">6. Check for rebound effects</w:t>
+      </w:r>
+      <w:r>
+        <w:rPr>
+          <w:b/>
+          <w:bCs/>
+          <w:color w:val="B8860B"/>
+        </w:rPr>
+        <w:t xml:space="preserve">  [MEDIUM PRIORITY]</w:t>
+      </w:r>
+    </w:p>
+    <w:p>
+      <w:pPr>
+        <w:ind w:left="360"/>
+      </w:pPr>
+      <w:r>
+        <w:rPr>
+          <w:b/>
+          <w:bCs/>
+        </w:rPr>
+        <w:t xml:space="preserve">Evidence gap: </w:t>
+      </w:r>
+      <w:r>
+        <w:t xml:space="preserve">Assumption not yet checked: lower costs do not lead customers to expand their use (e.g. irrigate more land with the water they save).</w:t>
+      </w:r>
+    </w:p>
+    <w:p>
+      <w:pPr>
+        <w:ind w:left="360"/>
+      </w:pPr>
+      <w:r>
+        <w:rPr>
+          <w:b/>
+          <w:bCs/>
+        </w:rPr>
+        <w:t xml:space="preserve">What it means: </w:t>
+      </w:r>
+      <w:r>
+        <w:t xml:space="preserve">Commercial success can then erode the net environmental benefit: the better the product sells, the more the rebound matters.</w:t>
+      </w:r>
+    </w:p>
+    <w:p>
+      <w:pPr>
+        <w:ind w:left="360"/>
+      </w:pPr>
+      <w:r>
+        <w:rPr>
+          <w:b/>
+          <w:bCs/>
+        </w:rPr>
+        <w:t xml:space="preserve">Recommended action: </w:t>
+      </w:r>
+      <w:r>
+        <w:t xml:space="preserve">Ask pilot customers what they do with the savings, and track the total, not only the per-unit, resource use.</w:t>
+      </w:r>
+    </w:p>
+    <w:p>
+      <w:pPr>
+        <w:ind w:left="360"/>
+      </w:pPr>
+      <w:r>
+        <w:rPr>
+          <w:b/>
+          <w:bCs/>
+        </w:rPr>
+        <w:t xml:space="preserve">Why now (Validation / MVP): </w:t>
+      </w:r>
+      <w:r>
+        <w:t xml:space="preserve">At validation the open question is whether real customers adopt the product and use it as intended. Worth doing now, after the high-priority items.</w:t>
+      </w:r>
+    </w:p>
+    <w:p>
+      <w:pPr>
+        <w:pStyle w:val="Heading2"/>
+      </w:pPr>
+      <w:r>
+        <w:t xml:space="preserve">Points to consider</w:t>
+      </w:r>
+    </w:p>
+    <w:p>
+      <w:r>
+        <w:rPr>
+          <w:i/>
+          <w:iCs/>
+          <w:color w:val="5A6B62"/>
+          <w:sz w:val="19"/>
+          <w:szCs w:val="19"/>
+        </w:rPr>
         <w:t xml:space="preserve">Questions worth a thought. Ignore any that do not apply.</w:t>
       </w:r>
     </w:p>
@@ -2920,7 +3876,7 @@
         <w:pStyle w:val="Heading1"/>
       </w:pPr>
       <w:r>
-        <w:t xml:space="preserve">7. Review &amp; Updating Plan</w:t>
+        <w:t xml:space="preserve">8. Review &amp; Updating Plan</w:t>
       </w:r>
     </w:p>
     <w:p>

</xml_diff>

<commit_message>
Add one-click FieldSense demo and claim boundaries
"Explore a finished example" on the homepage loads the fictional
FieldSense assessment with a demo banner and a way back to a fresh
assessment; it confirms before replacing a real assessment. Claims in
step 4 gain a boundary field (what the figure includes and leaves out),
shown in all report formats, with a note when a measured or modelled
claim has none.

Co-Authored-By: Claude Opus 5.5 <noreply@anthropic.com>
Claude-Session: https://claude.ai/code/session_01NsReyfcWBUffzS8XqtSvgs
</commit_message>
<xml_diff>
--- a/sample_reports/FieldSense_impact_report.docx
+++ b/sample_reports/FieldSense_impact_report.docx
@@ -2447,6 +2447,18 @@
           <w:b/>
           <w:bCs/>
         </w:rPr>
+        <w:t xml:space="preserve">Boundary: </w:t>
+      </w:r>
+      <w:r>
+        <w:t xml:space="preserve">Farms with an active account and at least one installed sensor, as of the export date; excludes farms still onboarding.</w:t>
+      </w:r>
+    </w:p>
+    <w:p>
+      <w:r>
+        <w:rPr>
+          <w:b/>
+          <w:bCs/>
+        </w:rPr>
         <w:t xml:space="preserve">Relies on pathway step: </w:t>
       </w:r>
       <w:r>
@@ -2535,6 +2547,18 @@
       </w:r>
       <w:r>
         <w:t xml:space="preserve">Self-reported survey of 22 of 62 enrolled farms</w:t>
+      </w:r>
+    </w:p>
+    <w:p>
+      <w:r>
+        <w:rPr>
+          <w:b/>
+          <w:bCs/>
+        </w:rPr>
+        <w:t xml:space="preserve">Boundary: </w:t>
+      </w:r>
+      <w:r>
+        <w:t xml:space="preserve">22 of 62 pilot farms that answered the 2026 mid-season survey; self-selected respondents.</w:t>
       </w:r>
     </w:p>
     <w:p>
@@ -2646,6 +2670,18 @@
       </w:r>
       <w:r>
         <w:t xml:space="preserve">Published agronomic studies of comparable sensor-guided irrigation systems in other regions</w:t>
+      </w:r>
+    </w:p>
+    <w:p>
+      <w:r>
+        <w:rPr>
+          <w:b/>
+          <w:bCs/>
+        </w:rPr>
+        <w:t xml:space="preserve">Boundary: </w:t>
+      </w:r>
+      <w:r>
+        <w:t xml:space="preserve">Irrigation water applied per hectare on enrolled farms over one season; excludes pumping energy and any expansion of irrigated area.</w:t>
       </w:r>
     </w:p>
     <w:p>

</xml_diff>